<commit_message>
Regenerate report_v2.docx with latest editorial changes
Co-Authored-By: Claude Sonnet 4.6 <noreply@anthropic.com>
</commit_message>
<xml_diff>
--- a/results/report_v2_data/report_v2.docx
+++ b/results/report_v2_data/report_v2.docx
@@ -2,7 +2,7 @@
 <file path=word/document.xml><?xml version="1.0" encoding="utf-8"?>
 <w:document xmlns:w="http://schemas.openxmlformats.org/wordprocessingml/2006/main" xmlns:m="http://schemas.openxmlformats.org/officeDocument/2006/math" xmlns:r="http://schemas.openxmlformats.org/officeDocument/2006/relationships" xmlns:o="urn:schemas-microsoft-com:office:office" xmlns:v="urn:schemas-microsoft-com:vml" xmlns:w10="urn:schemas-microsoft-com:office:word" xmlns:a="http://schemas.openxmlformats.org/drawingml/2006/main" xmlns:pic="http://schemas.openxmlformats.org/drawingml/2006/picture" xmlns:wp="http://schemas.openxmlformats.org/drawingml/2006/wordprocessingDrawing">
   <w:body>
-    <w:bookmarkStart w:id="157" w:name="Xc81c5743c46a9ec32b201d9e8da3facbf859432"/>
+    <w:bookmarkStart w:id="161" w:name="Xc81c5743c46a9ec32b201d9e8da3facbf859432"/>
     <w:p>
       <w:pPr>
         <w:pStyle w:val="Heading1"/>
@@ -538,7 +538,7 @@
       </w:r>
     </w:p>
     <w:bookmarkEnd w:id="22"/>
-    <w:bookmarkStart w:id="31" w:name="introduction"/>
+    <w:bookmarkStart w:id="35" w:name="introduction"/>
     <w:p>
       <w:pPr>
         <w:pStyle w:val="Heading2"/>
@@ -886,7 +886,7 @@
       </w:r>
     </w:p>
     <w:bookmarkEnd w:id="28"/>
-    <w:bookmarkStart w:id="30" w:name="X011d52f0907e5b1fe6bcf97b2d3f6762754fd6d"/>
+    <w:bookmarkStart w:id="34" w:name="X011d52f0907e5b1fe6bcf97b2d3f6762754fd6d"/>
     <w:p>
       <w:pPr>
         <w:pStyle w:val="Heading3"/>
@@ -900,7 +900,7 @@
         <w:pStyle w:val="FirstParagraph"/>
       </w:pPr>
       <w:r>
-        <w:t xml:space="preserve">If you follow technology discourse in 2025, you might reasonably conclude that artificial general intelligence is the only future worth preparing for. In 2024 alone, over $252 billion flowed into AI and AGI companies —</w:t>
+        <w:t xml:space="preserve">If you follow technology discourse in 2025, you might reasonably conclude that artificial general intelligence is the only future worth preparing for. In 2024, over $252 billion in corporate investment flowed into AI and AGI companies —</w:t>
       </w:r>
       <w:r>
         <w:t xml:space="preserve"> </w:t>
@@ -914,10 +914,35 @@
         </w:r>
       </w:hyperlink>
       <w:r>
-        <w:t xml:space="preserve"> </w:t>
-      </w:r>
-      <w:r>
-        <w:t xml:space="preserve">and a 44% increase from the year before. Major governments have appointed AI safety czars. CEOs now casually discuss</w:t>
+        <w:t xml:space="preserve">. In 2025, AI startups alone raised</w:t>
+      </w:r>
+      <w:r>
+        <w:t xml:space="preserve"> </w:t>
+      </w:r>
+      <w:hyperlink r:id="rId30">
+        <w:r>
+          <w:rPr>
+            <w:rStyle w:val="Hyperlink"/>
+          </w:rPr>
+          <w:t xml:space="preserve">$211 billion in venture capital</w:t>
+        </w:r>
+      </w:hyperlink>
+      <w:r>
+        <w:t xml:space="preserve">, an 85% year-over-year increase, with</w:t>
+      </w:r>
+      <w:r>
+        <w:t xml:space="preserve"> </w:t>
+      </w:r>
+      <w:hyperlink r:id="rId31">
+        <w:r>
+          <w:rPr>
+            <w:rStyle w:val="Hyperlink"/>
+          </w:rPr>
+          <w:t xml:space="preserve">projections exceeding $500 billion for 2026</w:t>
+        </w:r>
+      </w:hyperlink>
+      <w:r>
+        <w:t xml:space="preserve">. Major governments have appointed AI safety czars. CEOs now casually discuss</w:t>
       </w:r>
       <w:r>
         <w:t xml:space="preserve"> </w:t>
@@ -945,120 +970,25 @@
         <w:pStyle w:val="BodyText"/>
       </w:pPr>
       <w:r>
-        <w:t xml:space="preserve">Our research identifies 39</w:t>
-      </w:r>
-      <w:r>
-        <w:t xml:space="preserve"> </w:t>
-      </w:r>
-      <w:r>
-        <w:t xml:space="preserve">“hyper-entities”</w:t>
-      </w:r>
-      <w:r>
-        <w:t xml:space="preserve">—future systems that don’t yet exist but are already organizing billions in investment and reshaping institutions around their anticipated arrival. These range from planetary-scale energy systems to new tools for collective decision-making, from programmable biology to infrastructure for shared truth. Many score highly on metrics that should matter to rational funders: broad benefit distribution, downside protection, and resilience to political shifts.</w:t>
-      </w:r>
-    </w:p>
-    <w:p>
-      <w:pPr>
-        <w:pStyle w:val="BodyText"/>
-      </w:pPr>
-      <w:r>
-        <w:t xml:space="preserve">Yet they receive fragmentary attention. Consider epistemic infrastructure—systems designed to help communities establish shared facts and navigate information disorders. By our analysis, projects in this space align strongly with human values and address urgent coordination failures. Total annual investment? Roughly what a single AI lab spends in a week. The same pattern repeats across governance innovation, distributed energy systems, and open science infrastructure.</w:t>
-      </w:r>
-    </w:p>
-    <w:p>
-      <w:pPr>
-        <w:pStyle w:val="BodyText"/>
-      </w:pPr>
-      <w:r>
-        <w:t xml:space="preserve">This imbalance carries real costs. First, many of these overlooked systems represent critical infrastructure for human flourishing regardless of AGI timelines. Whether artificial superintelligence arrives in 2030 or 2080, we’ll still need resilient energy systems, tools for democratic legitimacy, and ways to manage synthetic biology safely.</w:t>
-      </w:r>
-    </w:p>
-    <w:p>
-      <w:pPr>
-        <w:pStyle w:val="BodyText"/>
-      </w:pPr>
-      <w:r>
-        <w:t xml:space="preserve">Second, several entities on our list would actually help society navigate AGI’s arrival more safely. Better epistemic infrastructure means clearer public deliberation about AI governance. Advanced collective intelligence systems could help coordinate complex international AI safety regimes. We’re underfunding the very tools we’d need to handle the future we’re investing so heavily in creating.</w:t>
-      </w:r>
-    </w:p>
-    <w:p>
-      <w:pPr>
-        <w:pStyle w:val="BodyText"/>
-      </w:pPr>
-      <w:r>
-        <w:t xml:space="preserve">The argument here isn’t anti-AGI. It’s about portfolio theory applied to civilizational bets. A rational funder facing uncertainty should diversify across multiple scenarios. A rational society should invest in infrastructure that creates value across many possible futures, not just one.</w:t>
-      </w:r>
-    </w:p>
-    <w:p>
-      <w:pPr>
-        <w:pStyle w:val="BodyText"/>
-      </w:pPr>
-      <w:r>
-        <w:t xml:space="preserve">The d/acc framework—emphasizing technologies that distribute power, offer strong defense, and enable cooperation—provides one lens for identifying these overlooked opportunities. Our 39 hyper-entities represent a starting point for a more balanced conversation about which futures deserve resources, coordination, and serious policy attention.</w:t>
-      </w:r>
-    </w:p>
-    <w:bookmarkEnd w:id="30"/>
-    <w:bookmarkEnd w:id="31"/>
-    <w:bookmarkStart w:id="39" w:name="methodology"/>
-    <w:p>
-      <w:pPr>
-        <w:pStyle w:val="Heading2"/>
-      </w:pPr>
-      <w:r>
-        <w:t xml:space="preserve">Methodology</w:t>
-      </w:r>
-    </w:p>
-    <w:bookmarkStart w:id="32" w:name="three-stage-scoring-pipeline"/>
-    <w:p>
-      <w:pPr>
-        <w:pStyle w:val="Heading3"/>
-      </w:pPr>
-      <w:r>
-        <w:t xml:space="preserve">Three-Stage Scoring Pipeline</w:t>
-      </w:r>
-    </w:p>
-    <w:p>
-      <w:pPr>
-        <w:pStyle w:val="FirstParagraph"/>
-      </w:pPr>
-      <w:r>
-        <w:t xml:space="preserve">Scoring was performed by Claude (Anthropic’s AI assistant) via API, with human review and curation at each stage. The final entity selection was entirely human-driven through independent shortlisting by two researchers.</w:t>
-      </w:r>
-    </w:p>
-    <w:p>
-      <w:pPr>
-        <w:pStyle w:val="BodyText"/>
-      </w:pPr>
-      <w:r>
-        <w:rPr>
-          <w:b/>
-          <w:bCs/>
-        </w:rPr>
-        <w:t xml:space="preserve">Stage 1: Hyper-Entity Qualification (0-100).</w:t>
-      </w:r>
-      <w:r>
-        <w:t xml:space="preserve"> </w:t>
-      </w:r>
-      <w:r>
-        <w:t xml:space="preserve">Each candidate is scored on 9 axes (0-3 per axis): Non-existence, Plausibility, Design specificity, New action space, Roadmap clarity, Coordination gravity, Resource pull, Narrative centrality, and Pre-real effects. A candidate must score 67% or above to qualify.</w:t>
-      </w:r>
-    </w:p>
-    <w:p>
-      <w:pPr>
-        <w:pStyle w:val="BodyText"/>
-      </w:pPr>
-      <w:r>
-        <w:rPr>
-          <w:b/>
-          <w:bCs/>
-        </w:rPr>
-        <w:t xml:space="preserve">Stage 2: Technology Impact Assessment (0-100).</w:t>
-      </w:r>
-      <w:r>
-        <w:t xml:space="preserve"> </w:t>
-      </w:r>
-      <w:r>
-        <w:t xml:space="preserve">Qualified entities are scored on 14 dimensions (0-5 each) measuring the magnitude of potential effect — not desirability. Higher scores indicate greater transformative power</w:t>
+        <w:t xml:space="preserve">This project is an attempt to answer a different question: not</w:t>
+      </w:r>
+      <w:r>
+        <w:t xml:space="preserve"> </w:t>
+      </w:r>
+      <w:r>
+        <w:t xml:space="preserve">“what hyper-entity is most likely to arrive?”</w:t>
+      </w:r>
+      <w:r>
+        <w:t xml:space="preserve"> </w:t>
+      </w:r>
+      <w:r>
+        <w:t xml:space="preserve">but</w:t>
+      </w:r>
+      <w:r>
+        <w:t xml:space="preserve"> </w:t>
+      </w:r>
+      <w:r>
+        <w:t xml:space="preserve">“which ones</w:t>
       </w:r>
       <w:r>
         <w:t xml:space="preserve"> </w:t>
@@ -1068,6 +998,162 @@
           <w:i/>
           <w:iCs/>
         </w:rPr>
+        <w:t xml:space="preserve">should</w:t>
+      </w:r>
+      <w:r>
+        <w:t xml:space="preserve"> </w:t>
+      </w:r>
+      <w:r>
+        <w:t xml:space="preserve">we be naming, funding, and building toward, given the kind of future we actually want?”</w:t>
+      </w:r>
+    </w:p>
+    <w:p>
+      <w:pPr>
+        <w:pStyle w:val="BodyText"/>
+      </w:pPr>
+      <w:r>
+        <w:t xml:space="preserve">Our research identifies 39 such entities, ranging from planetary-scale energy systems to new tools for collective decision-making, from programmable biology to infrastructure for shared truth. Many score highly on metrics that should matter to rational funders: broad benefit distribution, downside protection, and resilience to political shifts.</w:t>
+      </w:r>
+    </w:p>
+    <w:p>
+      <w:pPr>
+        <w:pStyle w:val="BodyText"/>
+      </w:pPr>
+      <w:r>
+        <w:t xml:space="preserve">Yet they receive fragmentary attention. Consider epistemic infrastructure—systems designed to help communities establish shared facts and navigate information disorders. By our analysis, projects in this space align strongly with human values and address urgent coordination failures. The biggest philanthropic initiative in the space, Google’s</w:t>
+      </w:r>
+      <w:r>
+        <w:t xml:space="preserve"> </w:t>
+      </w:r>
+      <w:hyperlink r:id="rId32">
+        <w:r>
+          <w:rPr>
+            <w:rStyle w:val="Hyperlink"/>
+          </w:rPr>
+          <w:t xml:space="preserve">Global Fact Check Fund</w:t>
+        </w:r>
+      </w:hyperlink>
+      <w:r>
+        <w:t xml:space="preserve">, totals $13.2M — what OpenAI spends in</w:t>
+      </w:r>
+      <w:r>
+        <w:t xml:space="preserve"> </w:t>
+      </w:r>
+      <w:hyperlink r:id="rId33">
+        <w:r>
+          <w:rPr>
+            <w:rStyle w:val="Hyperlink"/>
+          </w:rPr>
+          <w:t xml:space="preserve">under 24 hours</w:t>
+        </w:r>
+      </w:hyperlink>
+      <w:r>
+        <w:t xml:space="preserve">. The same pattern repeats across governance innovation, distributed energy systems, and open science infrastructure.</w:t>
+      </w:r>
+    </w:p>
+    <w:p>
+      <w:pPr>
+        <w:pStyle w:val="BodyText"/>
+      </w:pPr>
+      <w:r>
+        <w:t xml:space="preserve">This imbalance carries real costs. First, many of these overlooked systems represent critical infrastructure for human flourishing regardless of AGI timelines. Whether artificial superintelligence arrives in 2030 or 2080, we’ll still need resilient energy systems, tools for democratic legitimacy, and ways to manage synthetic biology safely.</w:t>
+      </w:r>
+    </w:p>
+    <w:p>
+      <w:pPr>
+        <w:pStyle w:val="BodyText"/>
+      </w:pPr>
+      <w:r>
+        <w:t xml:space="preserve">Second, several entities on our list would actually help society navigate AGI’s arrival more safely. Better epistemic infrastructure means clearer public deliberation about AI governance. Advanced collective intelligence systems could help coordinate complex international AI safety regimes. We’re underfunding the very tools we’d need to handle the future we’re investing so heavily in creating.</w:t>
+      </w:r>
+    </w:p>
+    <w:p>
+      <w:pPr>
+        <w:pStyle w:val="BodyText"/>
+      </w:pPr>
+      <w:r>
+        <w:t xml:space="preserve">The argument here isn’t anti-AGI. It’s closer to portfolio theory applied to civilizational bets: under genuine uncertainty, concentration in a single scenario carries real risk. Infrastructure that creates value across many possible futures — not just one — seems worth naming, even if the allocation decisions belong to others.</w:t>
+      </w:r>
+    </w:p>
+    <w:p>
+      <w:pPr>
+        <w:pStyle w:val="BodyText"/>
+      </w:pPr>
+      <w:r>
+        <w:t xml:space="preserve">The d/acc framework—emphasizing technologies that distribute power, offer strong defense, and enable cooperation—provides one lens for identifying these overlooked opportunities. Our 39 hyper-entities represent a starting point for a more balanced conversation about which futures deserve resources, coordination, and serious policy attention.</w:t>
+      </w:r>
+    </w:p>
+    <w:bookmarkEnd w:id="34"/>
+    <w:bookmarkEnd w:id="35"/>
+    <w:bookmarkStart w:id="43" w:name="methodology"/>
+    <w:p>
+      <w:pPr>
+        <w:pStyle w:val="Heading2"/>
+      </w:pPr>
+      <w:r>
+        <w:t xml:space="preserve">Methodology</w:t>
+      </w:r>
+    </w:p>
+    <w:bookmarkStart w:id="36" w:name="three-stage-scoring-pipeline"/>
+    <w:p>
+      <w:pPr>
+        <w:pStyle w:val="Heading3"/>
+      </w:pPr>
+      <w:r>
+        <w:t xml:space="preserve">Three-Stage Scoring Pipeline</w:t>
+      </w:r>
+    </w:p>
+    <w:p>
+      <w:pPr>
+        <w:pStyle w:val="FirstParagraph"/>
+      </w:pPr>
+      <w:r>
+        <w:t xml:space="preserve">Scoring was performed by Claude (Anthropic’s AI assistant) via API, with human review and curation at each stage. The final entity selection was entirely human-driven through independent shortlisting by two researchers.</w:t>
+      </w:r>
+    </w:p>
+    <w:p>
+      <w:pPr>
+        <w:pStyle w:val="BodyText"/>
+      </w:pPr>
+      <w:r>
+        <w:rPr>
+          <w:b/>
+          <w:bCs/>
+        </w:rPr>
+        <w:t xml:space="preserve">Stage 1: Hyper-Entity Qualification (0-100).</w:t>
+      </w:r>
+      <w:r>
+        <w:t xml:space="preserve"> </w:t>
+      </w:r>
+      <w:r>
+        <w:t xml:space="preserve">Each candidate is scored on 9 axes (0-3 per axis): Non-existence, Plausibility, Design specificity, New action space, Roadmap clarity, Coordination gravity, Resource pull, Narrative centrality, and Pre-real effects. A candidate must score 67% or above to qualify.</w:t>
+      </w:r>
+    </w:p>
+    <w:p>
+      <w:pPr>
+        <w:pStyle w:val="BodyText"/>
+      </w:pPr>
+      <w:r>
+        <w:rPr>
+          <w:b/>
+          <w:bCs/>
+        </w:rPr>
+        <w:t xml:space="preserve">Stage 2: Technology Impact Assessment (0-100).</w:t>
+      </w:r>
+      <w:r>
+        <w:t xml:space="preserve"> </w:t>
+      </w:r>
+      <w:r>
+        <w:t xml:space="preserve">Qualified entities are scored on 14 dimensions (0-5 each) measuring the magnitude of potential effect — not desirability. Higher scores indicate greater transformative power</w:t>
+      </w:r>
+      <w:r>
+        <w:t xml:space="preserve"> </w:t>
+      </w:r>
+      <w:r>
+        <w:rPr>
+          <w:i/>
+          <w:iCs/>
+        </w:rPr>
         <w:t xml:space="preserve">and</w:t>
       </w:r>
       <w:r>
@@ -1095,8 +1181,8 @@
         <w:t xml:space="preserve">Based on Vitalik Buterin’s d/acc framework, evaluating whether a technology aligns with values that promote human flourishing.</w:t>
       </w:r>
     </w:p>
-    <w:bookmarkEnd w:id="32"/>
-    <w:bookmarkStart w:id="33" w:name="the-dacc-framework"/>
+    <w:bookmarkEnd w:id="36"/>
+    <w:bookmarkStart w:id="37" w:name="the-dacc-framework"/>
     <w:p>
       <w:pPr>
         <w:pStyle w:val="Heading3"/>
@@ -1197,8 +1283,8 @@
         <w:t xml:space="preserve">We score each entity 0-5 on each dimension (0-100% normalized). A high d/acc score signals that a technology, if realized, would likely expand human agency and resilience rather than concentrate power or create new vulnerabilities.</w:t>
       </w:r>
     </w:p>
-    <w:bookmarkEnd w:id="33"/>
-    <w:bookmarkStart w:id="34" w:name="how-to-read-the-scores"/>
+    <w:bookmarkEnd w:id="37"/>
+    <w:bookmarkStart w:id="38" w:name="how-to-read-the-scores"/>
     <w:p>
       <w:pPr>
         <w:pStyle w:val="Heading3"/>
@@ -1215,8 +1301,8 @@
         <w:t xml:space="preserve">This report evaluates hyper-entities using two independent scoring systems that measure fundamentally different things.</w:t>
       </w:r>
     </w:p>
-    <w:bookmarkEnd w:id="34"/>
-    <w:bookmarkStart w:id="35" w:name="X74f664f24e89dbfb527ce474de6d9b17271b72b"/>
+    <w:bookmarkEnd w:id="38"/>
+    <w:bookmarkStart w:id="39" w:name="X74f664f24e89dbfb527ce474de6d9b17271b72b"/>
     <w:p>
       <w:pPr>
         <w:pStyle w:val="Heading3"/>
@@ -1362,8 +1448,8 @@
         <w:t xml:space="preserve">want something to exist.</w:t>
       </w:r>
     </w:p>
-    <w:bookmarkEnd w:id="35"/>
-    <w:bookmarkStart w:id="36" w:name="X244b7ed2b3d421be2aa9a9b5a4e257fc2d0d3dd"/>
+    <w:bookmarkEnd w:id="39"/>
+    <w:bookmarkStart w:id="40" w:name="X244b7ed2b3d421be2aa9a9b5a4e257fc2d0d3dd"/>
     <w:p>
       <w:pPr>
         <w:pStyle w:val="Heading3"/>
@@ -1441,8 +1527,8 @@
         <w:t xml:space="preserve">—they may indicate specialized tools serving specific communities well.</w:t>
       </w:r>
     </w:p>
-    <w:bookmarkEnd w:id="36"/>
-    <w:bookmarkStart w:id="37" w:name="reading-the-scatter-plot"/>
+    <w:bookmarkEnd w:id="40"/>
+    <w:bookmarkStart w:id="41" w:name="reading-the-scatter-plot"/>
     <w:p>
       <w:pPr>
         <w:pStyle w:val="Heading3"/>
@@ -1570,8 +1656,8 @@
         <w:t xml:space="preserve">are provided where meaningful — though hyper-entities by definition resist precise forecasting. Ranges should be interpreted as order-of-magnitude guidance rather than predictions.</w:t>
       </w:r>
     </w:p>
-    <w:bookmarkEnd w:id="37"/>
-    <w:bookmarkStart w:id="38" w:name="curation-process"/>
+    <w:bookmarkEnd w:id="41"/>
+    <w:bookmarkStart w:id="42" w:name="curation-process"/>
     <w:p>
       <w:pPr>
         <w:pStyle w:val="Heading3"/>
@@ -1712,9 +1798,9 @@
         <w:t xml:space="preserve">Entity analyses were produced by Claude (Anthropic’s AI) from the source material and reviewed by the research team. Open Questions sections reflect genuine uncertainties in the field, not editorial positions.</w:t>
       </w:r>
     </w:p>
-    <w:bookmarkEnd w:id="38"/>
-    <w:bookmarkEnd w:id="39"/>
-    <w:bookmarkStart w:id="45" w:name="key-findings"/>
+    <w:bookmarkEnd w:id="42"/>
+    <w:bookmarkEnd w:id="43"/>
+    <w:bookmarkStart w:id="49" w:name="key-findings"/>
     <w:p>
       <w:pPr>
         <w:pStyle w:val="Heading2"/>
@@ -1723,7 +1809,7 @@
         <w:t xml:space="preserve">Key Findings</w:t>
       </w:r>
     </w:p>
-    <w:bookmarkStart w:id="42" w:name="Xf217ded798a7c0736225df5e383aba4deb02b1f"/>
+    <w:bookmarkStart w:id="46" w:name="Xf217ded798a7c0736225df5e383aba4deb02b1f"/>
     <w:p>
       <w:pPr>
         <w:pStyle w:val="Heading3"/>
@@ -1741,12 +1827,12 @@
           <wp:inline>
             <wp:extent cx="5334000" cy="3812479"/>
             <wp:effectExtent b="0" l="0" r="0" t="0"/>
-            <wp:docPr descr="Scatter plot: d/acc alignment vs technology impact" title="" id="40" name="Picture"/>
+            <wp:docPr descr="Scatter plot: d/acc alignment vs technology impact" title="" id="44" name="Picture"/>
             <a:graphic>
               <a:graphicData uri="http://schemas.openxmlformats.org/drawingml/2006/picture">
                 <pic:pic>
                   <pic:nvPicPr>
-                    <pic:cNvPr descr="scatter_plot.png" id="41" name="Picture"/>
+                    <pic:cNvPr descr="scatter_plot.png" id="45" name="Picture"/>
                     <pic:cNvPicPr>
                       <a:picLocks noChangeArrowheads="1" noChangeAspect="1"/>
                     </pic:cNvPicPr>
@@ -1799,8 +1885,8 @@
         <w:t xml:space="preserve">29 of 39 entities plotted; 10 entities excluded due to missing technology impact scores.</w:t>
       </w:r>
     </w:p>
-    <w:bookmarkEnd w:id="42"/>
-    <w:bookmarkStart w:id="43" w:name="most-undervalued-shortlist"/>
+    <w:bookmarkEnd w:id="46"/>
+    <w:bookmarkStart w:id="47" w:name="most-undervalued-shortlist"/>
     <w:p>
       <w:pPr>
         <w:pStyle w:val="Heading3"/>
@@ -1964,8 +2050,8 @@
         <w:t xml:space="preserve">— d/acc: 85%, Tech: 63%</w:t>
       </w:r>
     </w:p>
-    <w:bookmarkEnd w:id="43"/>
-    <w:bookmarkStart w:id="44" w:name="maturity-distribution"/>
+    <w:bookmarkEnd w:id="47"/>
+    <w:bookmarkStart w:id="48" w:name="maturity-distribution"/>
     <w:p>
       <w:pPr>
         <w:pStyle w:val="Heading3"/>
@@ -2044,9 +2130,9 @@
         <w:t xml:space="preserve">Near Deployment | 2 |</w:t>
       </w:r>
     </w:p>
-    <w:bookmarkEnd w:id="44"/>
-    <w:bookmarkEnd w:id="45"/>
-    <w:bookmarkStart w:id="154" w:name="consensus-entities"/>
+    <w:bookmarkEnd w:id="48"/>
+    <w:bookmarkEnd w:id="49"/>
+    <w:bookmarkStart w:id="158" w:name="consensus-entities"/>
     <w:p>
       <w:pPr>
         <w:pStyle w:val="Heading2"/>
@@ -2063,7 +2149,7 @@
         <w:t xml:space="preserve">The 39 consensus entities are organized into nine thematic groups. One pair of entries (Reputational Markets and Prediction Markets as Decision Support Systems) is presented as a single merged entity, Prediction &amp; Reputation Markets. 15 entities receive full write-ups; 24 are presented in summary format.</w:t>
       </w:r>
     </w:p>
-    <w:bookmarkStart w:id="46" w:name="ai-human-agency"/>
+    <w:bookmarkStart w:id="50" w:name="ai-human-agency"/>
     <w:p>
       <w:pPr>
         <w:pStyle w:val="Heading3"/>
@@ -2096,8 +2182,8 @@
         <w:t xml:space="preserve">deeply personalized systems that operate at the scale of individual human lives, not populations. Unlike chatbots that serve millions identically, these proposals envision AI systems with long-term commitments to specific people—filtering information on your behalf, coaching you through emotional challenges, or even holding legal obligations to act in your interest alone. The pattern reveals a bet that agency and alignment problems might be easier to solve when AI systems have clear principals and sustained relationships, rather than trying to optimize for humanity in aggregate.</w:t>
       </w:r>
     </w:p>
-    <w:bookmarkEnd w:id="46"/>
-    <w:bookmarkStart w:id="56" w:name="fiduciary-ai-assistance"/>
+    <w:bookmarkEnd w:id="50"/>
+    <w:bookmarkStart w:id="60" w:name="fiduciary-ai-assistance"/>
     <w:p>
       <w:pPr>
         <w:pStyle w:val="Heading3"/>
@@ -2176,7 +2262,7 @@
       <w:r>
         <w:t xml:space="preserve">The concept has gained intellectual traction—</w:t>
       </w:r>
-      <w:hyperlink r:id="rId47">
+      <w:hyperlink r:id="rId51">
         <w:r>
           <w:rPr>
             <w:rStyle w:val="Hyperlink"/>
@@ -2205,7 +2291,7 @@
       <w:r>
         <w:t xml:space="preserve"> </w:t>
       </w:r>
-      <w:hyperlink r:id="rId48">
+      <w:hyperlink r:id="rId52">
         <w:r>
           <w:rPr>
             <w:rStyle w:val="Hyperlink"/>
@@ -2222,7 +2308,7 @@
       <w:r>
         <w:t xml:space="preserve"> </w:t>
       </w:r>
-      <w:hyperlink r:id="rId49">
+      <w:hyperlink r:id="rId53">
         <w:r>
           <w:rPr>
             <w:rStyle w:val="Hyperlink"/>
@@ -2236,7 +2322,7 @@
       <w:r>
         <w:t xml:space="preserve"> </w:t>
       </w:r>
-      <w:hyperlink r:id="rId50">
+      <w:hyperlink r:id="rId54">
         <w:r>
           <w:rPr>
             <w:rStyle w:val="Hyperlink"/>
@@ -2250,7 +2336,7 @@
       <w:r>
         <w:t xml:space="preserve"> </w:t>
       </w:r>
-      <w:hyperlink r:id="rId51">
+      <w:hyperlink r:id="rId55">
         <w:r>
           <w:rPr>
             <w:rStyle w:val="Hyperlink"/>
@@ -2279,7 +2365,7 @@
       <w:r>
         <w:t xml:space="preserve"> </w:t>
       </w:r>
-      <w:hyperlink r:id="rId50">
+      <w:hyperlink r:id="rId54">
         <w:r>
           <w:rPr>
             <w:rStyle w:val="Hyperlink"/>
@@ -2296,7 +2382,7 @@
       <w:r>
         <w:t xml:space="preserve"> </w:t>
       </w:r>
-      <w:hyperlink r:id="rId52">
+      <w:hyperlink r:id="rId56">
         <w:r>
           <w:rPr>
             <w:rStyle w:val="Hyperlink"/>
@@ -2313,7 +2399,7 @@
       <w:r>
         <w:t xml:space="preserve"> </w:t>
       </w:r>
-      <w:hyperlink r:id="rId53">
+      <w:hyperlink r:id="rId57">
         <w:r>
           <w:rPr>
             <w:rStyle w:val="Hyperlink"/>
@@ -2342,7 +2428,7 @@
       <w:r>
         <w:t xml:space="preserve"> </w:t>
       </w:r>
-      <w:hyperlink r:id="rId54">
+      <w:hyperlink r:id="rId58">
         <w:r>
           <w:rPr>
             <w:rStyle w:val="Hyperlink"/>
@@ -2359,7 +2445,7 @@
       <w:r>
         <w:t xml:space="preserve"> </w:t>
       </w:r>
-      <w:hyperlink r:id="rId55">
+      <w:hyperlink r:id="rId59">
         <w:r>
           <w:rPr>
             <w:rStyle w:val="Hyperlink"/>
@@ -2404,8 +2490,8 @@
         <w:t xml:space="preserve">when users themselves are inconsistent—should your AI let you eat the cookie or enforce your diet? This paternalism dilemma has no current solution. The legal question is wide open: what does it mean for software to breach fiduciary duty, and who enforces it? Until someone demonstrates a profitable path to individual-first AI, platforms have every incentive to maintain the status quo.</w:t>
       </w:r>
     </w:p>
-    <w:bookmarkEnd w:id="56"/>
-    <w:bookmarkStart w:id="63" w:name="egolets-personal-ai-assistants"/>
+    <w:bookmarkEnd w:id="60"/>
+    <w:bookmarkStart w:id="67" w:name="egolets-personal-ai-assistants"/>
     <w:p>
       <w:pPr>
         <w:pStyle w:val="Heading3"/>
@@ -2503,7 +2589,7 @@
       <w:r>
         <w:t xml:space="preserve"> </w:t>
       </w:r>
-      <w:hyperlink r:id="rId57">
+      <w:hyperlink r:id="rId61">
         <w:r>
           <w:rPr>
             <w:rStyle w:val="Hyperlink"/>
@@ -2517,30 +2603,120 @@
       <w:r>
         <w:t xml:space="preserve"> </w:t>
       </w:r>
+      <w:hyperlink r:id="rId62">
+        <w:r>
+          <w:rPr>
+            <w:rStyle w:val="Hyperlink"/>
+          </w:rPr>
+          <w:t xml:space="preserve">Anthropic</w:t>
+        </w:r>
+      </w:hyperlink>
+      <w:r>
+        <w:t xml:space="preserve">’s Claude, and Google’s Gemini learn user preferences through conversation history. Startups like</w:t>
+      </w:r>
+      <w:r>
+        <w:t xml:space="preserve"> </w:t>
+      </w:r>
+      <w:hyperlink r:id="rId54">
+        <w:r>
+          <w:rPr>
+            <w:rStyle w:val="Hyperlink"/>
+          </w:rPr>
+          <w:t xml:space="preserve">Inflection AI</w:t>
+        </w:r>
+      </w:hyperlink>
+      <w:r>
+        <w:t xml:space="preserve">,</w:t>
+      </w:r>
+      <w:r>
+        <w:t xml:space="preserve"> </w:t>
+      </w:r>
+      <w:hyperlink r:id="rId59">
+        <w:r>
+          <w:rPr>
+            <w:rStyle w:val="Hyperlink"/>
+          </w:rPr>
+          <w:t xml:space="preserve">Replika</w:t>
+        </w:r>
+      </w:hyperlink>
+      <w:r>
+        <w:t xml:space="preserve">, and</w:t>
+      </w:r>
+      <w:r>
+        <w:t xml:space="preserve"> </w:t>
+      </w:r>
       <w:hyperlink r:id="rId58">
         <w:r>
           <w:rPr>
             <w:rStyle w:val="Hyperlink"/>
           </w:rPr>
-          <w:t xml:space="preserve">Anthropic</w:t>
-        </w:r>
-      </w:hyperlink>
-      <w:r>
-        <w:t xml:space="preserve">’s Claude, and Google’s Gemini learn user preferences through conversation history. Startups like</w:t>
-      </w:r>
-      <w:r>
-        <w:t xml:space="preserve"> </w:t>
-      </w:r>
-      <w:hyperlink r:id="rId50">
-        <w:r>
-          <w:rPr>
-            <w:rStyle w:val="Hyperlink"/>
-          </w:rPr>
-          <w:t xml:space="preserve">Inflection AI</w:t>
-        </w:r>
-      </w:hyperlink>
-      <w:r>
-        <w:t xml:space="preserve">,</w:t>
+          <w:t xml:space="preserve">Character.AI</w:t>
+        </w:r>
+      </w:hyperlink>
+      <w:r>
+        <w:t xml:space="preserve"> </w:t>
+      </w:r>
+      <w:r>
+        <w:t xml:space="preserve">explore personality modeling and emotional rapport. Apple Intelligence (2024) integrates on-device personal context. But none construct genuine cognitive portraits that mirror individual reasoning architectures—they personalize outputs, not decision-making frameworks. The gap between</w:t>
+      </w:r>
+      <w:r>
+        <w:t xml:space="preserve"> </w:t>
+      </w:r>
+      <w:r>
+        <w:t xml:space="preserve">“remembers what you said”</w:t>
+      </w:r>
+      <w:r>
+        <w:t xml:space="preserve"> </w:t>
+      </w:r>
+      <w:r>
+        <w:t xml:space="preserve">and</w:t>
+      </w:r>
+      <w:r>
+        <w:t xml:space="preserve"> </w:t>
+      </w:r>
+      <w:r>
+        <w:t xml:space="preserve">“thinks like you think”</w:t>
+      </w:r>
+      <w:r>
+        <w:t xml:space="preserve"> </w:t>
+      </w:r>
+      <w:r>
+        <w:t xml:space="preserve">remains vast. We can save conversation context; we cannot yet capture the subtle heuristics, contradictions, and domain-specific expertise that define how a person actually makes choices.</w:t>
+      </w:r>
+    </w:p>
+    <w:p>
+      <w:pPr>
+        <w:pStyle w:val="BodyText"/>
+      </w:pPr>
+      <w:r>
+        <w:rPr>
+          <w:b/>
+          <w:bCs/>
+        </w:rPr>
+        <w:t xml:space="preserve">Who’s pushing it forward.</w:t>
+      </w:r>
+      <w:r>
+        <w:t xml:space="preserve"> </w:t>
+      </w:r>
+      <w:r>
+        <w:t xml:space="preserve">The technical building blocks are advancing separately:</w:t>
+      </w:r>
+      <w:r>
+        <w:t xml:space="preserve"> </w:t>
+      </w:r>
+      <w:hyperlink r:id="rId63">
+        <w:r>
+          <w:rPr>
+            <w:rStyle w:val="Hyperlink"/>
+          </w:rPr>
+          <w:t xml:space="preserve">OpenMined</w:t>
+        </w:r>
+      </w:hyperlink>
+      <w:r>
+        <w:t xml:space="preserve"> </w:t>
+      </w:r>
+      <w:r>
+        <w:t xml:space="preserve">develops privacy-preserving machine learning for training on personal data without centralized exposure.</w:t>
       </w:r>
       <w:r>
         <w:t xml:space="preserve"> </w:t>
@@ -2550,96 +2726,6 @@
           <w:rPr>
             <w:rStyle w:val="Hyperlink"/>
           </w:rPr>
-          <w:t xml:space="preserve">Replika</w:t>
-        </w:r>
-      </w:hyperlink>
-      <w:r>
-        <w:t xml:space="preserve">, and</w:t>
-      </w:r>
-      <w:r>
-        <w:t xml:space="preserve"> </w:t>
-      </w:r>
-      <w:hyperlink r:id="rId54">
-        <w:r>
-          <w:rPr>
-            <w:rStyle w:val="Hyperlink"/>
-          </w:rPr>
-          <w:t xml:space="preserve">Character.AI</w:t>
-        </w:r>
-      </w:hyperlink>
-      <w:r>
-        <w:t xml:space="preserve"> </w:t>
-      </w:r>
-      <w:r>
-        <w:t xml:space="preserve">explore personality modeling and emotional rapport. Apple Intelligence (2024) integrates on-device personal context. But none construct genuine cognitive portraits that mirror individual reasoning architectures—they personalize outputs, not decision-making frameworks. The gap between</w:t>
-      </w:r>
-      <w:r>
-        <w:t xml:space="preserve"> </w:t>
-      </w:r>
-      <w:r>
-        <w:t xml:space="preserve">“remembers what you said”</w:t>
-      </w:r>
-      <w:r>
-        <w:t xml:space="preserve"> </w:t>
-      </w:r>
-      <w:r>
-        <w:t xml:space="preserve">and</w:t>
-      </w:r>
-      <w:r>
-        <w:t xml:space="preserve"> </w:t>
-      </w:r>
-      <w:r>
-        <w:t xml:space="preserve">“thinks like you think”</w:t>
-      </w:r>
-      <w:r>
-        <w:t xml:space="preserve"> </w:t>
-      </w:r>
-      <w:r>
-        <w:t xml:space="preserve">remains vast. We can save conversation context; we cannot yet capture the subtle heuristics, contradictions, and domain-specific expertise that define how a person actually makes choices.</w:t>
-      </w:r>
-    </w:p>
-    <w:p>
-      <w:pPr>
-        <w:pStyle w:val="BodyText"/>
-      </w:pPr>
-      <w:r>
-        <w:rPr>
-          <w:b/>
-          <w:bCs/>
-        </w:rPr>
-        <w:t xml:space="preserve">Who’s pushing it forward.</w:t>
-      </w:r>
-      <w:r>
-        <w:t xml:space="preserve"> </w:t>
-      </w:r>
-      <w:r>
-        <w:t xml:space="preserve">The technical building blocks are advancing separately:</w:t>
-      </w:r>
-      <w:r>
-        <w:t xml:space="preserve"> </w:t>
-      </w:r>
-      <w:hyperlink r:id="rId59">
-        <w:r>
-          <w:rPr>
-            <w:rStyle w:val="Hyperlink"/>
-          </w:rPr>
-          <w:t xml:space="preserve">OpenMined</w:t>
-        </w:r>
-      </w:hyperlink>
-      <w:r>
-        <w:t xml:space="preserve"> </w:t>
-      </w:r>
-      <w:r>
-        <w:t xml:space="preserve">develops privacy-preserving machine learning for training on personal data without centralized exposure.</w:t>
-      </w:r>
-      <w:r>
-        <w:t xml:space="preserve"> </w:t>
-      </w:r>
-      <w:hyperlink r:id="rId51">
-        <w:r>
-          <w:rPr>
-            <w:rStyle w:val="Hyperlink"/>
-          </w:rPr>
           <w:t xml:space="preserve">Hugging Face</w:t>
         </w:r>
       </w:hyperlink>
@@ -2652,7 +2738,7 @@
       <w:r>
         <w:t xml:space="preserve"> </w:t>
       </w:r>
-      <w:hyperlink r:id="rId60">
+      <w:hyperlink r:id="rId64">
         <w:r>
           <w:rPr>
             <w:rStyle w:val="Hyperlink"/>
@@ -2669,7 +2755,7 @@
       <w:r>
         <w:t xml:space="preserve"> </w:t>
       </w:r>
-      <w:hyperlink r:id="rId61">
+      <w:hyperlink r:id="rId65">
         <w:r>
           <w:rPr>
             <w:rStyle w:val="Hyperlink"/>
@@ -2711,7 +2797,7 @@
         <w:t xml:space="preserve">—how do we measure whether an AI’s decisions match what you would actually choose? Second, human reasoning is contextual, contradictory, and evolving; any static portrait becomes stale or reductively simplifies messy humanity. Third, deep unresolved questions surround identity and liability when an AI acts as your cognitive proxy: Who’s responsible for its recommendations? What happens when your EgoLet disagrees with your current self? Can you consent to an AI that knows you better than you know yourself? And pragmatically, data portability standards don’t exist to aggregate your decision history across platforms—the raw material EgoLets would need remains siloed across incompatible services.</w:t>
       </w:r>
     </w:p>
-    <w:bookmarkStart w:id="62" w:name="additional-entities"/>
+    <w:bookmarkStart w:id="66" w:name="additional-entities"/>
     <w:p>
       <w:pPr>
         <w:pStyle w:val="Heading4"/>
@@ -2752,9 +2838,9 @@
         <w:t xml:space="preserve">Lifelong AI Guardians | Early Demonstrations | 65% | 70% | Lifelong AI Guardians would create continuous, privacy-preserving monitoring systems that track children’s development across fragmented settings—schools, homes, healthcare visits—detecting early warning signs that currently fall through institutional cracks. These systems aim to shift child welfare from reactive crisis response to proactive support by building longitudinal profiles that spot subtle developmental deviations before they become serious problems. The concept matters because developmental challenges caught early are far more treatable, yet our current siloed institutions routinely miss critical signals until intervention becomes costly and less effective. |</w:t>
       </w:r>
     </w:p>
-    <w:bookmarkEnd w:id="62"/>
-    <w:bookmarkEnd w:id="63"/>
-    <w:bookmarkStart w:id="64" w:name="energy-infrastructure"/>
+    <w:bookmarkEnd w:id="66"/>
+    <w:bookmarkEnd w:id="67"/>
+    <w:bookmarkStart w:id="68" w:name="energy-infrastructure"/>
     <w:p>
       <w:pPr>
         <w:pStyle w:val="Heading3"/>
@@ -2771,8 +2857,8 @@
         <w:t xml:space="preserve">These three entities emerge from a common recognition that existing energy and governance systems move too slowly to match the pace of both climate change and technological opportunity. What unites them is a shift from waiting for centralized infrastructure upgrades to creating parallel systems—whether through mesh energy networks that route around utilities, small modular reactors that bypass traditional nuclear timelines, or jurisdictions that compete to attract climate adaptation investment. Together, they represent a bet that coordination problems in energy and climate will be solved not through better planning, but through creating alternatives that make the old systems obsolete.</w:t>
       </w:r>
     </w:p>
-    <w:bookmarkEnd w:id="64"/>
-    <w:bookmarkStart w:id="68" w:name="decentralized-adaptive-energy-network"/>
+    <w:bookmarkEnd w:id="68"/>
+    <w:bookmarkStart w:id="72" w:name="decentralized-adaptive-energy-network"/>
     <w:p>
       <w:pPr>
         <w:pStyle w:val="Heading3"/>
@@ -2842,7 +2928,7 @@
       <w:r>
         <w:t xml:space="preserve"> </w:t>
       </w:r>
-      <w:hyperlink r:id="rId65">
+      <w:hyperlink r:id="rId69">
         <w:r>
           <w:rPr>
             <w:rStyle w:val="Hyperlink"/>
@@ -2859,7 +2945,7 @@
       <w:r>
         <w:t xml:space="preserve"> </w:t>
       </w:r>
-      <w:hyperlink r:id="rId66">
+      <w:hyperlink r:id="rId70">
         <w:r>
           <w:rPr>
             <w:rStyle w:val="Hyperlink"/>
@@ -2876,7 +2962,7 @@
       <w:r>
         <w:t xml:space="preserve"> </w:t>
       </w:r>
-      <w:hyperlink r:id="rId67">
+      <w:hyperlink r:id="rId71">
         <w:r>
           <w:rPr>
             <w:rStyle w:val="Hyperlink"/>
@@ -2927,8 +3013,8 @@
         <w:t xml:space="preserve">Can millions of distributed devices coordinate in real-time without centralized dispatch? The cybersecurity challenge is formidable — a distributed network offers a massive attack surface. Grid stability requires split-second frequency and voltage regulation; whether decentralized algorithms can match centralized control remains unproven at scale. Interoperability standards are fragmented (IEEE 2030.5, OpenADR, competing protocols), making seamless device communication difficult. Most critically, will regulators and utilities embrace business model disruption, or will institutional resistance delay deployment by decades? The likely path is gradual evolution over 10-20 years rather than revolutionary transformation — more creeping decentralization than clean break.</w:t>
       </w:r>
     </w:p>
-    <w:bookmarkEnd w:id="68"/>
-    <w:bookmarkStart w:id="74" w:name="deep-fision-micro-nuclear-reactors"/>
+    <w:bookmarkEnd w:id="72"/>
+    <w:bookmarkStart w:id="78" w:name="deep-fision-micro-nuclear-reactors"/>
     <w:p>
       <w:pPr>
         <w:pStyle w:val="Heading3"/>
@@ -2968,7 +3054,7 @@
       <w:r>
         <w:t xml:space="preserve"> </w:t>
       </w:r>
-      <w:hyperlink r:id="rId69">
+      <w:hyperlink r:id="rId73">
         <w:r>
           <w:rPr>
             <w:rStyle w:val="Hyperlink"/>
@@ -3015,7 +3101,7 @@
       <w:r>
         <w:t xml:space="preserve"> </w:t>
       </w:r>
-      <w:hyperlink r:id="rId70">
+      <w:hyperlink r:id="rId74">
         <w:r>
           <w:rPr>
             <w:rStyle w:val="Hyperlink"/>
@@ -3032,7 +3118,7 @@
       <w:r>
         <w:t xml:space="preserve"> </w:t>
       </w:r>
-      <w:hyperlink r:id="rId71">
+      <w:hyperlink r:id="rId75">
         <w:r>
           <w:rPr>
             <w:rStyle w:val="Hyperlink"/>
@@ -3049,7 +3135,7 @@
       <w:r>
         <w:t xml:space="preserve"> </w:t>
       </w:r>
-      <w:hyperlink r:id="rId72">
+      <w:hyperlink r:id="rId76">
         <w:r>
           <w:rPr>
             <w:rStyle w:val="Hyperlink"/>
@@ -3100,7 +3186,7 @@
         <w:t xml:space="preserve">The regulatory framework for autonomous underground nuclear generation simply doesn’t exist — no one has written the rules for this deployment mode. Can Deep Fission convince regulators to certify a reactor design that operates untouched for decades in an inaccessible location? The economics are unproven: factory manufacturing at automotive scale requires gigafactory-level capital investment before a single unit generates revenue. And crucially, will communities accept distributed underground nuclear installations, even with inherent safety advantages? The public acceptance question remains completely untested. Finally, it’s unclear whether thorium fuel cycles can be manufactured and deployed at the claimed cost and timeline — the supply chain doesn’t exist yet.</w:t>
       </w:r>
     </w:p>
-    <w:bookmarkStart w:id="73" w:name="additional-entities-1"/>
+    <w:bookmarkStart w:id="77" w:name="additional-entities-1"/>
     <w:p>
       <w:pPr>
         <w:pStyle w:val="Heading4"/>
@@ -3133,9 +3219,9 @@
         <w:t xml:space="preserve">Climate Adaptation Jurisdictional Arbitrage | Early Demonstrations | 80% | N/A | Climate Adaptation Jurisdictional Arbitrage proposes building new cities and special economic zones specifically designed to absorb climate migrants before displacement crises occur, turning forced migration from a humanitarian disaster into an opportunity for economic development. Rather than waiting for millions to flee uninhabitable regions and overwhelm unprepared cities—as we’re already seeing with heat waves in South Asia and sea-level rise in Pacific islands—this approach would create legal and economic frameworks that allow people to relocate to purpose-built communities with jobs, infrastructure, and integration pathways. The concept matters because current climate migration projections suggest 200 million to 1 billion people could be displaced by 2050, and reactive humanitarian responses have consistently failed to provide dignified, economically productive outcomes for displaced populations. |</w:t>
       </w:r>
     </w:p>
-    <w:bookmarkEnd w:id="73"/>
-    <w:bookmarkEnd w:id="74"/>
-    <w:bookmarkStart w:id="75" w:name="ethics-moral-expansion"/>
+    <w:bookmarkEnd w:id="77"/>
+    <w:bookmarkEnd w:id="78"/>
+    <w:bookmarkStart w:id="79" w:name="ethics-moral-expansion"/>
     <w:p>
       <w:pPr>
         <w:pStyle w:val="Heading3"/>
@@ -3152,8 +3238,8 @@
         <w:t xml:space="preserve">These hyper-entities explore technologies and institutional frameworks designed to systematically expand humanity’s capacity for moral consideration—moving beyond current tribes, species, and even timeframes to create coordination mechanisms that account for vastly more stakeholders. What unites them is the recognition that our existing moral intuitions evolved for small-scale societies and may be inadequate for an era of planetary-scale impacts and potentially transformative AI. Together, they suggest that moral progress might not just happen through cultural evolution, but could be deliberately engineered through new tools for perspective-taking, value alignment, and inter-group negotiation.</w:t>
       </w:r>
     </w:p>
-    <w:bookmarkEnd w:id="75"/>
-    <w:bookmarkStart w:id="82" w:name="expanded-moral-circle-technologies"/>
+    <w:bookmarkEnd w:id="79"/>
+    <w:bookmarkStart w:id="86" w:name="expanded-moral-circle-technologies"/>
     <w:p>
       <w:pPr>
         <w:pStyle w:val="Heading3"/>
@@ -3235,7 +3321,7 @@
       <w:r>
         <w:t xml:space="preserve"> </w:t>
       </w:r>
-      <w:hyperlink r:id="rId76">
+      <w:hyperlink r:id="rId80">
         <w:r>
           <w:rPr>
             <w:rStyle w:val="Hyperlink"/>
@@ -3252,7 +3338,7 @@
       <w:r>
         <w:t xml:space="preserve"> </w:t>
       </w:r>
-      <w:hyperlink r:id="rId77">
+      <w:hyperlink r:id="rId81">
         <w:r>
           <w:rPr>
             <w:rStyle w:val="Hyperlink"/>
@@ -3269,7 +3355,7 @@
       <w:r>
         <w:t xml:space="preserve"> </w:t>
       </w:r>
-      <w:hyperlink r:id="rId78">
+      <w:hyperlink r:id="rId82">
         <w:r>
           <w:rPr>
             <w:rStyle w:val="Hyperlink"/>
@@ -3286,7 +3372,7 @@
       <w:r>
         <w:t xml:space="preserve"> </w:t>
       </w:r>
-      <w:hyperlink r:id="rId79">
+      <w:hyperlink r:id="rId83">
         <w:r>
           <w:rPr>
             <w:rStyle w:val="Hyperlink"/>
@@ -3333,7 +3419,7 @@
       <w:r>
         <w:t xml:space="preserve"> </w:t>
       </w:r>
-      <w:hyperlink r:id="rId77">
+      <w:hyperlink r:id="rId81">
         <w:r>
           <w:rPr>
             <w:rStyle w:val="Hyperlink"/>
@@ -3347,7 +3433,7 @@
       <w:r>
         <w:t xml:space="preserve"> </w:t>
       </w:r>
-      <w:hyperlink r:id="rId80">
+      <w:hyperlink r:id="rId84">
         <w:r>
           <w:rPr>
             <w:rStyle w:val="Hyperlink"/>
@@ -3392,7 +3478,7 @@
         <w:t xml:space="preserve">remains unsolved. Practically, the technology requires breakthroughs in neural mapping granularity that may not be feasible with current physics. The coordination problem is equally severe: expanding moral circles requires simultaneous advances in consciousness science, communication technology, and legal frameworks that currently operate in separate institutional silos. Most likely, progress happens through concrete demonstrations—like using decoded whale communication to build legal personhood campaigns—rather than comprehensive empathy translation systems.</w:t>
       </w:r>
     </w:p>
-    <w:bookmarkStart w:id="81" w:name="additional-entities-2"/>
+    <w:bookmarkStart w:id="85" w:name="additional-entities-2"/>
     <w:p>
       <w:pPr>
         <w:pStyle w:val="Heading4"/>
@@ -3431,9 +3517,9 @@
         <w:t xml:space="preserve">—turning moral conflicts from zero-sum fights into negotiable trades that leave everyone better off. This matters because today’s biggest societal deadlocks, from climate policy to bioethics, fail not because we lack technical solutions but because we have no mechanism to honor the legitimate moral diversity across populations, forcing crude majoritarian compromises that satisfy no one. If feasible, moral trade could unlock cooperative solutions to currently intractable conflicts by treating ethical preferences with the same sophistication that markets bring to economic preferences. |</w:t>
       </w:r>
     </w:p>
-    <w:bookmarkEnd w:id="81"/>
-    <w:bookmarkEnd w:id="82"/>
-    <w:bookmarkStart w:id="83" w:name="governance-collective-intelligence"/>
+    <w:bookmarkEnd w:id="85"/>
+    <w:bookmarkEnd w:id="86"/>
+    <w:bookmarkStart w:id="87" w:name="governance-collective-intelligence"/>
     <w:p>
       <w:pPr>
         <w:pStyle w:val="Heading3"/>
@@ -3468,8 +3554,8 @@
         <w:t xml:space="preserve">“how should we even decide what to decide, and can we prove it worked?”</w:t>
       </w:r>
     </w:p>
-    <w:bookmarkEnd w:id="83"/>
-    <w:bookmarkStart w:id="91" w:name="competitive-governance-protocol-stack"/>
+    <w:bookmarkEnd w:id="87"/>
+    <w:bookmarkStart w:id="95" w:name="competitive-governance-protocol-stack"/>
     <w:p>
       <w:pPr>
         <w:pStyle w:val="Heading3"/>
@@ -3539,7 +3625,7 @@
       <w:r>
         <w:t xml:space="preserve"> </w:t>
       </w:r>
-      <w:hyperlink r:id="rId84">
+      <w:hyperlink r:id="rId88">
         <w:r>
           <w:rPr>
             <w:rStyle w:val="Hyperlink"/>
@@ -3556,7 +3642,7 @@
       <w:r>
         <w:t xml:space="preserve"> </w:t>
       </w:r>
-      <w:hyperlink r:id="rId85">
+      <w:hyperlink r:id="rId89">
         <w:r>
           <w:rPr>
             <w:rStyle w:val="Hyperlink"/>
@@ -3573,7 +3659,7 @@
       <w:r>
         <w:t xml:space="preserve"> </w:t>
       </w:r>
-      <w:hyperlink r:id="rId86">
+      <w:hyperlink r:id="rId90">
         <w:r>
           <w:rPr>
             <w:rStyle w:val="Hyperlink"/>
@@ -3590,7 +3676,7 @@
       <w:r>
         <w:t xml:space="preserve"> </w:t>
       </w:r>
-      <w:hyperlink r:id="rId87">
+      <w:hyperlink r:id="rId91">
         <w:r>
           <w:rPr>
             <w:rStyle w:val="Hyperlink"/>
@@ -3607,7 +3693,7 @@
       <w:r>
         <w:t xml:space="preserve"> </w:t>
       </w:r>
-      <w:hyperlink r:id="rId88">
+      <w:hyperlink r:id="rId92">
         <w:r>
           <w:rPr>
             <w:rStyle w:val="Hyperlink"/>
@@ -3642,7 +3728,7 @@
       <w:r>
         <w:t xml:space="preserve"> </w:t>
       </w:r>
-      <w:hyperlink r:id="rId89">
+      <w:hyperlink r:id="rId93">
         <w:r>
           <w:rPr>
             <w:rStyle w:val="Hyperlink"/>
@@ -3659,7 +3745,7 @@
       <w:r>
         <w:t xml:space="preserve"> </w:t>
       </w:r>
-      <w:hyperlink r:id="rId90">
+      <w:hyperlink r:id="rId94">
         <w:r>
           <w:rPr>
             <w:rStyle w:val="Hyperlink"/>
@@ -3692,8 +3778,8 @@
         <w:t xml:space="preserve">The fundamental barrier is sovereignty: nation-states have a monopoly on legitimate force and zero incentive to enable frictionless citizen exit. Can a governance protocol achieve meaningful scale without buy-in from existing states? The technical challenges are significant but likely solvable — zero-knowledge proofs for privacy-preserving credential portability, sybil-resistant identity without centralized control, governance performance metrics resistant to gaming. The deeper problem is bootstrapping: the protocol only becomes valuable when multiple jurisdictions adopt it, creating a chicken-and-egg coordination problem that established geopolitical structures actively resist. Even if technical and legal barriers fall, it’s unclear whether citizens actually want governance choice or prefer the simplicity of monolithic systems.</w:t>
       </w:r>
     </w:p>
-    <w:bookmarkEnd w:id="91"/>
-    <w:bookmarkStart w:id="95" w:name="lexcommons"/>
+    <w:bookmarkEnd w:id="95"/>
+    <w:bookmarkStart w:id="99" w:name="lexcommons"/>
     <w:p>
       <w:pPr>
         <w:pStyle w:val="Heading3"/>
@@ -3780,109 +3866,109 @@
       <w:r>
         <w:t xml:space="preserve"> </w:t>
       </w:r>
+      <w:hyperlink r:id="rId96">
+        <w:r>
+          <w:rPr>
+            <w:rStyle w:val="Hyperlink"/>
+          </w:rPr>
+          <w:t xml:space="preserve">Kleros</w:t>
+        </w:r>
+      </w:hyperlink>
+      <w:r>
+        <w:t xml:space="preserve"> </w:t>
+      </w:r>
+      <w:r>
+        <w:t xml:space="preserve">has been running decentralized arbitration on Ethereum since 2018, processing thousands of disputes using crowdsourced jurors incentivized by tokens—demonstrating blockchain-based dispute resolution works at small scale. AI legal tools like</w:t>
+      </w:r>
+      <w:r>
+        <w:t xml:space="preserve"> </w:t>
+      </w:r>
+      <w:hyperlink r:id="rId97">
+        <w:r>
+          <w:rPr>
+            <w:rStyle w:val="Hyperlink"/>
+          </w:rPr>
+          <w:t xml:space="preserve">Harvey AI</w:t>
+        </w:r>
+      </w:hyperlink>
+      <w:r>
+        <w:t xml:space="preserve"> </w:t>
+      </w:r>
+      <w:r>
+        <w:t xml:space="preserve">(founded 2022, backed by Sequoia and OpenAI) now handle contract analysis and legal research using large language models.</w:t>
+      </w:r>
+      <w:r>
+        <w:t xml:space="preserve"> </w:t>
+      </w:r>
+      <w:hyperlink r:id="rId98">
+        <w:r>
+          <w:rPr>
+            <w:rStyle w:val="Hyperlink"/>
+          </w:rPr>
+          <w:t xml:space="preserve">Creative Commons</w:t>
+        </w:r>
+      </w:hyperlink>
+      <w:r>
+        <w:t xml:space="preserve"> </w:t>
+      </w:r>
+      <w:r>
+        <w:t xml:space="preserve">has shown open-source licensing can work at global scale. But these remain separate pieces. No system combines AI legal interpretation, blockchain enforcement, and participatory governance into a unified alternative to state-backed courts. Current smart contracts handle simple</w:t>
+      </w:r>
+      <w:r>
+        <w:t xml:space="preserve"> </w:t>
+      </w:r>
+      <w:r>
+        <w:t xml:space="preserve">“if-then”</w:t>
+      </w:r>
+      <w:r>
+        <w:t xml:space="preserve"> </w:t>
+      </w:r>
+      <w:r>
+        <w:t xml:space="preserve">logic well but struggle with ambiguous or context-dependent situations—the bread and butter of real legal disputes.</w:t>
+      </w:r>
+    </w:p>
+    <w:p>
+      <w:pPr>
+        <w:pStyle w:val="BodyText"/>
+      </w:pPr>
+      <w:r>
+        <w:rPr>
+          <w:b/>
+          <w:bCs/>
+        </w:rPr>
+        <w:t xml:space="preserve">Who’s pushing it forward.</w:t>
+      </w:r>
+      <w:r>
+        <w:t xml:space="preserve"> </w:t>
+      </w:r>
+      <w:r>
+        <w:t xml:space="preserve">Decentralized governance platforms like</w:t>
+      </w:r>
+      <w:r>
+        <w:t xml:space="preserve"> </w:t>
+      </w:r>
+      <w:hyperlink r:id="rId94">
+        <w:r>
+          <w:rPr>
+            <w:rStyle w:val="Hyperlink"/>
+          </w:rPr>
+          <w:t xml:space="preserve">Aragon</w:t>
+        </w:r>
+      </w:hyperlink>
+      <w:r>
+        <w:t xml:space="preserve"> </w:t>
+      </w:r>
+      <w:r>
+        <w:t xml:space="preserve">and</w:t>
+      </w:r>
+      <w:r>
+        <w:t xml:space="preserve"> </w:t>
+      </w:r>
       <w:hyperlink r:id="rId92">
         <w:r>
           <w:rPr>
             <w:rStyle w:val="Hyperlink"/>
           </w:rPr>
-          <w:t xml:space="preserve">Kleros</w:t>
-        </w:r>
-      </w:hyperlink>
-      <w:r>
-        <w:t xml:space="preserve"> </w:t>
-      </w:r>
-      <w:r>
-        <w:t xml:space="preserve">has been running decentralized arbitration on Ethereum since 2018, processing thousands of disputes using crowdsourced jurors incentivized by tokens—demonstrating blockchain-based dispute resolution works at small scale. AI legal tools like</w:t>
-      </w:r>
-      <w:r>
-        <w:t xml:space="preserve"> </w:t>
-      </w:r>
-      <w:hyperlink r:id="rId93">
-        <w:r>
-          <w:rPr>
-            <w:rStyle w:val="Hyperlink"/>
-          </w:rPr>
-          <w:t xml:space="preserve">Harvey AI</w:t>
-        </w:r>
-      </w:hyperlink>
-      <w:r>
-        <w:t xml:space="preserve"> </w:t>
-      </w:r>
-      <w:r>
-        <w:t xml:space="preserve">(founded 2022, backed by Sequoia and OpenAI) now handle contract analysis and legal research using large language models.</w:t>
-      </w:r>
-      <w:r>
-        <w:t xml:space="preserve"> </w:t>
-      </w:r>
-      <w:hyperlink r:id="rId94">
-        <w:r>
-          <w:rPr>
-            <w:rStyle w:val="Hyperlink"/>
-          </w:rPr>
-          <w:t xml:space="preserve">Creative Commons</w:t>
-        </w:r>
-      </w:hyperlink>
-      <w:r>
-        <w:t xml:space="preserve"> </w:t>
-      </w:r>
-      <w:r>
-        <w:t xml:space="preserve">has shown open-source licensing can work at global scale. But these remain separate pieces. No system combines AI legal interpretation, blockchain enforcement, and participatory governance into a unified alternative to state-backed courts. Current smart contracts handle simple</w:t>
-      </w:r>
-      <w:r>
-        <w:t xml:space="preserve"> </w:t>
-      </w:r>
-      <w:r>
-        <w:t xml:space="preserve">“if-then”</w:t>
-      </w:r>
-      <w:r>
-        <w:t xml:space="preserve"> </w:t>
-      </w:r>
-      <w:r>
-        <w:t xml:space="preserve">logic well but struggle with ambiguous or context-dependent situations—the bread and butter of real legal disputes.</w:t>
-      </w:r>
-    </w:p>
-    <w:p>
-      <w:pPr>
-        <w:pStyle w:val="BodyText"/>
-      </w:pPr>
-      <w:r>
-        <w:rPr>
-          <w:b/>
-          <w:bCs/>
-        </w:rPr>
-        <w:t xml:space="preserve">Who’s pushing it forward.</w:t>
-      </w:r>
-      <w:r>
-        <w:t xml:space="preserve"> </w:t>
-      </w:r>
-      <w:r>
-        <w:t xml:space="preserve">Decentralized governance platforms like</w:t>
-      </w:r>
-      <w:r>
-        <w:t xml:space="preserve"> </w:t>
-      </w:r>
-      <w:hyperlink r:id="rId90">
-        <w:r>
-          <w:rPr>
-            <w:rStyle w:val="Hyperlink"/>
-          </w:rPr>
-          <w:t xml:space="preserve">Aragon</w:t>
-        </w:r>
-      </w:hyperlink>
-      <w:r>
-        <w:t xml:space="preserve"> </w:t>
-      </w:r>
-      <w:r>
-        <w:t xml:space="preserve">and</w:t>
-      </w:r>
-      <w:r>
-        <w:t xml:space="preserve"> </w:t>
-      </w:r>
-      <w:hyperlink r:id="rId88">
-        <w:r>
-          <w:rPr>
-            <w:rStyle w:val="Hyperlink"/>
-          </w:rPr>
           <w:t xml:space="preserve">Snapshot</w:t>
         </w:r>
       </w:hyperlink>
@@ -3919,8 +4005,8 @@
         <w:t xml:space="preserve">While smart contract platforms like Ethereum exist, LexCommons represents the not-yet-built layer of AI-native legal agents and cross-jurisdictional open-source governance that no current system provides.</w:t>
       </w:r>
     </w:p>
-    <w:bookmarkEnd w:id="95"/>
-    <w:bookmarkStart w:id="100" w:name="conflict-de-escalation-protocol"/>
+    <w:bookmarkEnd w:id="99"/>
+    <w:bookmarkStart w:id="104" w:name="conflict-de-escalation-protocol"/>
     <w:p>
       <w:pPr>
         <w:pStyle w:val="Heading3"/>
@@ -3990,80 +4076,80 @@
       <w:r>
         <w:t xml:space="preserve"> </w:t>
       </w:r>
+      <w:hyperlink r:id="rId100">
+        <w:r>
+          <w:rPr>
+            <w:rStyle w:val="Hyperlink"/>
+          </w:rPr>
+          <w:t xml:space="preserve">Hume AI</w:t>
+        </w:r>
+      </w:hyperlink>
+      <w:r>
+        <w:t xml:space="preserve"> </w:t>
+      </w:r>
+      <w:r>
+        <w:t xml:space="preserve">can analyze vocal tone and facial expressions to assess emotional states in real-time. Mental health chatbots like</w:t>
+      </w:r>
+      <w:r>
+        <w:t xml:space="preserve"> </w:t>
+      </w:r>
+      <w:hyperlink r:id="rId101">
+        <w:r>
+          <w:rPr>
+            <w:rStyle w:val="Hyperlink"/>
+          </w:rPr>
+          <w:t xml:space="preserve">Woebot</w:t>
+        </w:r>
+      </w:hyperlink>
+      <w:r>
+        <w:t xml:space="preserve"> </w:t>
+      </w:r>
+      <w:r>
+        <w:t xml:space="preserve">use cognitive behavioral therapy dialogue strategies similar to de-escalation techniques. The</w:t>
+      </w:r>
+      <w:r>
+        <w:t xml:space="preserve"> </w:t>
+      </w:r>
+      <w:hyperlink r:id="rId102">
+        <w:r>
+          <w:rPr>
+            <w:rStyle w:val="Hyperlink"/>
+          </w:rPr>
+          <w:t xml:space="preserve">Consensus Building Institute</w:t>
+        </w:r>
+      </w:hyperlink>
+      <w:r>
+        <w:t xml:space="preserve"> </w:t>
+      </w:r>
+      <w:r>
+        <w:t xml:space="preserve">and Harvard’s Program on Negotiation have developed systematic frameworks that could inform AI design. But no system combines emotional intelligence, game-theoretic strategy, and progressive escalation protocols into unified mediation software. Current NLP still struggles with the contextual subtlety required—misreading power dynamics or cultural norms in a tense conversation risks making things worse, not better.</w:t>
+      </w:r>
+    </w:p>
+    <w:p>
+      <w:pPr>
+        <w:pStyle w:val="BodyText"/>
+      </w:pPr>
+      <w:r>
+        <w:rPr>
+          <w:b/>
+          <w:bCs/>
+        </w:rPr>
+        <w:t xml:space="preserve">Who’s pushing it forward.</w:t>
+      </w:r>
+      <w:r>
+        <w:t xml:space="preserve"> </w:t>
+      </w:r>
+      <w:r>
+        <w:t xml:space="preserve">No dedicated organization is building this specific vision yet. The concept exists primarily in academic discussions about AI-assisted dispute resolution and in the design space of platforms like</w:t>
+      </w:r>
+      <w:r>
+        <w:t xml:space="preserve"> </w:t>
+      </w:r>
       <w:hyperlink r:id="rId96">
         <w:r>
           <w:rPr>
             <w:rStyle w:val="Hyperlink"/>
           </w:rPr>
-          <w:t xml:space="preserve">Hume AI</w:t>
-        </w:r>
-      </w:hyperlink>
-      <w:r>
-        <w:t xml:space="preserve"> </w:t>
-      </w:r>
-      <w:r>
-        <w:t xml:space="preserve">can analyze vocal tone and facial expressions to assess emotional states in real-time. Mental health chatbots like</w:t>
-      </w:r>
-      <w:r>
-        <w:t xml:space="preserve"> </w:t>
-      </w:r>
-      <w:hyperlink r:id="rId97">
-        <w:r>
-          <w:rPr>
-            <w:rStyle w:val="Hyperlink"/>
-          </w:rPr>
-          <w:t xml:space="preserve">Woebot</w:t>
-        </w:r>
-      </w:hyperlink>
-      <w:r>
-        <w:t xml:space="preserve"> </w:t>
-      </w:r>
-      <w:r>
-        <w:t xml:space="preserve">use cognitive behavioral therapy dialogue strategies similar to de-escalation techniques. The</w:t>
-      </w:r>
-      <w:r>
-        <w:t xml:space="preserve"> </w:t>
-      </w:r>
-      <w:hyperlink r:id="rId98">
-        <w:r>
-          <w:rPr>
-            <w:rStyle w:val="Hyperlink"/>
-          </w:rPr>
-          <w:t xml:space="preserve">Consensus Building Institute</w:t>
-        </w:r>
-      </w:hyperlink>
-      <w:r>
-        <w:t xml:space="preserve"> </w:t>
-      </w:r>
-      <w:r>
-        <w:t xml:space="preserve">and Harvard’s Program on Negotiation have developed systematic frameworks that could inform AI design. But no system combines emotional intelligence, game-theoretic strategy, and progressive escalation protocols into unified mediation software. Current NLP still struggles with the contextual subtlety required—misreading power dynamics or cultural norms in a tense conversation risks making things worse, not better.</w:t>
-      </w:r>
-    </w:p>
-    <w:p>
-      <w:pPr>
-        <w:pStyle w:val="BodyText"/>
-      </w:pPr>
-      <w:r>
-        <w:rPr>
-          <w:b/>
-          <w:bCs/>
-        </w:rPr>
-        <w:t xml:space="preserve">Who’s pushing it forward.</w:t>
-      </w:r>
-      <w:r>
-        <w:t xml:space="preserve"> </w:t>
-      </w:r>
-      <w:r>
-        <w:t xml:space="preserve">No dedicated organization is building this specific vision yet. The concept exists primarily in academic discussions about AI-assisted dispute resolution and in the design space of platforms like</w:t>
-      </w:r>
-      <w:r>
-        <w:t xml:space="preserve"> </w:t>
-      </w:r>
-      <w:hyperlink r:id="rId92">
-        <w:r>
-          <w:rPr>
-            <w:rStyle w:val="Hyperlink"/>
-          </w:rPr>
           <w:t xml:space="preserve">Kleros</w:t>
         </w:r>
       </w:hyperlink>
@@ -4073,7 +4159,7 @@
       <w:r>
         <w:t xml:space="preserve"> </w:t>
       </w:r>
-      <w:hyperlink r:id="rId54">
+      <w:hyperlink r:id="rId58">
         <w:r>
           <w:rPr>
             <w:rStyle w:val="Hyperlink"/>
@@ -4090,7 +4176,7 @@
       <w:r>
         <w:t xml:space="preserve"> </w:t>
       </w:r>
-      <w:hyperlink r:id="rId55">
+      <w:hyperlink r:id="rId59">
         <w:r>
           <w:rPr>
             <w:rStyle w:val="Hyperlink"/>
@@ -4107,7 +4193,7 @@
       <w:r>
         <w:t xml:space="preserve"> </w:t>
       </w:r>
-      <w:hyperlink r:id="rId99">
+      <w:hyperlink r:id="rId103">
         <w:r>
           <w:rPr>
             <w:rStyle w:val="Hyperlink"/>
@@ -4140,8 +4226,8 @@
         <w:t xml:space="preserve">Can AI reliably make normative judgments about fairness and proportionality across different cultural contexts? The progressive framework requires the system to decide when negotiation has failed and restoration should begin—inherently contested territory. Who would trust an AI mediator in genuine high-stakes conflict without demonstrated reliability and institutional backing? Liability remains unclear if the system’s recommendations escalate rather than resolve disputes. The most pragmatic path likely starts with low-stakes, structured conflicts (landlord-tenant, workplace disagreements) where training data can be collected and outcomes measured, before attempting complex interpersonal or international mediation. Whether parties in real conflict would accept algorithmic mediation over human judgment remains an open empirical question.</w:t>
       </w:r>
     </w:p>
-    <w:bookmarkEnd w:id="100"/>
-    <w:bookmarkStart w:id="107" w:name="global-deliberation-coordinator-gdaas"/>
+    <w:bookmarkEnd w:id="104"/>
+    <w:bookmarkStart w:id="111" w:name="global-deliberation-coordinator-gdaas"/>
     <w:p>
       <w:pPr>
         <w:pStyle w:val="Heading3"/>
@@ -4211,7 +4297,7 @@
       <w:r>
         <w:t xml:space="preserve"> </w:t>
       </w:r>
-      <w:hyperlink r:id="rId99">
+      <w:hyperlink r:id="rId103">
         <w:r>
           <w:rPr>
             <w:rStyle w:val="Hyperlink"/>
@@ -4228,7 +4314,7 @@
       <w:r>
         <w:t xml:space="preserve"> </w:t>
       </w:r>
-      <w:hyperlink r:id="rId80">
+      <w:hyperlink r:id="rId84">
         <w:r>
           <w:rPr>
             <w:rStyle w:val="Hyperlink"/>
@@ -4257,7 +4343,7 @@
       <w:r>
         <w:t xml:space="preserve"> </w:t>
       </w:r>
-      <w:hyperlink r:id="rId101">
+      <w:hyperlink r:id="rId105">
         <w:r>
           <w:rPr>
             <w:rStyle w:val="Hyperlink"/>
@@ -4274,7 +4360,7 @@
       <w:r>
         <w:t xml:space="preserve"> </w:t>
       </w:r>
-      <w:hyperlink r:id="rId102">
+      <w:hyperlink r:id="rId106">
         <w:r>
           <w:rPr>
             <w:rStyle w:val="Hyperlink"/>
@@ -4291,7 +4377,7 @@
       <w:r>
         <w:t xml:space="preserve"> </w:t>
       </w:r>
-      <w:hyperlink r:id="rId103">
+      <w:hyperlink r:id="rId107">
         <w:r>
           <w:rPr>
             <w:rStyle w:val="Hyperlink"/>
@@ -4308,7 +4394,7 @@
       <w:r>
         <w:t xml:space="preserve"> </w:t>
       </w:r>
-      <w:hyperlink r:id="rId104">
+      <w:hyperlink r:id="rId108">
         <w:r>
           <w:rPr>
             <w:rStyle w:val="Hyperlink"/>
@@ -4340,25 +4426,25 @@
       <w:r>
         <w:t xml:space="preserve"> </w:t>
       </w:r>
+      <w:hyperlink r:id="rId109">
+        <w:r>
+          <w:rPr>
+            <w:rStyle w:val="Hyperlink"/>
+          </w:rPr>
+          <w:t xml:space="preserve">Foresight Institute</w:t>
+        </w:r>
+      </w:hyperlink>
+      <w:r>
+        <w:t xml:space="preserve">’s Existential Hope TAI Institution Design Hackathon in February 2024, winning shared second place. The team included Aviv Ovadya from</w:t>
+      </w:r>
+      <w:r>
+        <w:t xml:space="preserve"> </w:t>
+      </w:r>
       <w:hyperlink r:id="rId105">
         <w:r>
           <w:rPr>
             <w:rStyle w:val="Hyperlink"/>
           </w:rPr>
-          <w:t xml:space="preserve">Foresight Institute</w:t>
-        </w:r>
-      </w:hyperlink>
-      <w:r>
-        <w:t xml:space="preserve">’s Existential Hope TAI Institution Design Hackathon in February 2024, winning shared second place. The team included Aviv Ovadya from</w:t>
-      </w:r>
-      <w:r>
-        <w:t xml:space="preserve"> </w:t>
-      </w:r>
-      <w:hyperlink r:id="rId101">
-        <w:r>
-          <w:rPr>
-            <w:rStyle w:val="Hyperlink"/>
-          </w:rPr>
           <w:t xml:space="preserve">newDemocracy</w:t>
         </w:r>
       </w:hyperlink>
@@ -4408,7 +4494,7 @@
         <w:t xml:space="preserve">model—deliberation on demand—would attract genuine engagement or become performative theater.</w:t>
       </w:r>
     </w:p>
-    <w:bookmarkStart w:id="106" w:name="additional-entities-3"/>
+    <w:bookmarkStart w:id="110" w:name="additional-entities-3"/>
     <w:p>
       <w:pPr>
         <w:pStyle w:val="Heading4"/>
@@ -4449,9 +4535,9 @@
         <w:t xml:space="preserve">Habermas Machines | Early Demonstrations | 75% | 60% | Habermas Machines are AI systems designed to help diverse groups find common ground by processing everyone’s input into clearer collective statements, cutting through the communication breakdowns and power dynamics that usually derail group decisions. Named after philosopher Jürgen Habermas, they promise to salvage democratic deliberation at a moment when polarization, information overload, and bad-faith debate have made consensus feel impossible. If they work, they could transform everything from corporate board meetings to citizen assemblies—but they also raise hard questions about whether algorithms should mediate human understanding at all. |</w:t>
       </w:r>
     </w:p>
-    <w:bookmarkEnd w:id="106"/>
-    <w:bookmarkEnd w:id="107"/>
-    <w:bookmarkStart w:id="108" w:name="mind-brain-human-augmentation"/>
+    <w:bookmarkEnd w:id="110"/>
+    <w:bookmarkEnd w:id="111"/>
+    <w:bookmarkStart w:id="112" w:name="mind-brain-human-augmentation"/>
     <w:p>
       <w:pPr>
         <w:pStyle w:val="Heading3"/>
@@ -4480,8 +4566,8 @@
         <w:t xml:space="preserve">increasingly difficult to answer. The maturity spectrum here is vast, from translation models already reshaping how billions communicate to whole brain emulation that remains speculative, but the common thread is a future where human intelligence becomes a substrate that can be copied, enhanced, governed, or seamlessly integrated with machines.</w:t>
       </w:r>
     </w:p>
-    <w:bookmarkEnd w:id="108"/>
-    <w:bookmarkStart w:id="112" w:name="digital-mind-governance-systems"/>
+    <w:bookmarkEnd w:id="112"/>
+    <w:bookmarkStart w:id="116" w:name="digital-mind-governance-systems"/>
     <w:p>
       <w:pPr>
         <w:pStyle w:val="Heading3"/>
@@ -4551,7 +4637,7 @@
       <w:r>
         <w:t xml:space="preserve"> </w:t>
       </w:r>
-      <w:hyperlink r:id="rId109">
+      <w:hyperlink r:id="rId113">
         <w:r>
           <w:rPr>
             <w:rStyle w:val="Hyperlink"/>
@@ -4568,7 +4654,7 @@
       <w:r>
         <w:t xml:space="preserve"> </w:t>
       </w:r>
-      <w:hyperlink r:id="rId110">
+      <w:hyperlink r:id="rId114">
         <w:r>
           <w:rPr>
             <w:rStyle w:val="Hyperlink"/>
@@ -4585,7 +4671,7 @@
       <w:r>
         <w:t xml:space="preserve"> </w:t>
       </w:r>
-      <w:hyperlink r:id="rId53">
+      <w:hyperlink r:id="rId57">
         <w:r>
           <w:rPr>
             <w:rStyle w:val="Hyperlink"/>
@@ -4602,7 +4688,7 @@
       <w:r>
         <w:t xml:space="preserve"> </w:t>
       </w:r>
-      <w:hyperlink r:id="rId52">
+      <w:hyperlink r:id="rId56">
         <w:r>
           <w:rPr>
             <w:rStyle w:val="Hyperlink"/>
@@ -4637,7 +4723,7 @@
       <w:r>
         <w:t xml:space="preserve"> </w:t>
       </w:r>
-      <w:hyperlink r:id="rId53">
+      <w:hyperlink r:id="rId57">
         <w:r>
           <w:rPr>
             <w:rStyle w:val="Hyperlink"/>
@@ -4654,7 +4740,7 @@
       <w:r>
         <w:t xml:space="preserve"> </w:t>
       </w:r>
-      <w:hyperlink r:id="rId80">
+      <w:hyperlink r:id="rId84">
         <w:r>
           <w:rPr>
             <w:rStyle w:val="Hyperlink"/>
@@ -4712,7 +4798,7 @@
         <w:t xml:space="preserve">even mean? Do copies get separate votes? Is deletion murder? No legal system has begun drafting legislation for non-biological persons. There’s also an acute coordination problem—the first jurisdiction to grant AI rights faces massive economic disadvantages, creating a race to the bottom. And we don’t know if current large language models experience anything at all, or if we’re decades away from systems complex enough to warrant these frameworks.</w:t>
       </w:r>
     </w:p>
-    <w:bookmarkStart w:id="111" w:name="additional-entities-4"/>
+    <w:bookmarkStart w:id="115" w:name="additional-entities-4"/>
     <w:p>
       <w:pPr>
         <w:pStyle w:val="Heading4"/>
@@ -4797,9 +4883,9 @@
         <w:t xml:space="preserve">and whether the scanning and simulation required is even physically possible. |</w:t>
       </w:r>
     </w:p>
-    <w:bookmarkEnd w:id="111"/>
-    <w:bookmarkEnd w:id="112"/>
-    <w:bookmarkStart w:id="113" w:name="manufacturing-matter"/>
+    <w:bookmarkEnd w:id="115"/>
+    <w:bookmarkEnd w:id="116"/>
+    <w:bookmarkStart w:id="117" w:name="manufacturing-matter"/>
     <w:p>
       <w:pPr>
         <w:pStyle w:val="Heading3"/>
@@ -4816,8 +4902,8 @@
         <w:t xml:space="preserve">These four entities share a common ambition: to radically democratize who can make things and what can be made, by turning matter itself into a programmable substrate. Where today’s manufacturing requires massive capital, specialized expertise, and fixed production lines, these visions imagine a future where designing and fabricating complex objects—from molecules to machines—becomes as accessible as writing code. Together, they suggest that the next frontier of technological empowerment isn’t just in bits (software anyone can write) but in atoms (matter anyone can arrange), with profound implications for economic power, supply chain resilience, and the very meaning of scarcity.</w:t>
       </w:r>
     </w:p>
-    <w:bookmarkEnd w:id="113"/>
-    <w:bookmarkStart w:id="118" w:name="end-user-programming-ecosystem"/>
+    <w:bookmarkEnd w:id="117"/>
+    <w:bookmarkStart w:id="122" w:name="end-user-programming-ecosystem"/>
     <w:p>
       <w:pPr>
         <w:pStyle w:val="Heading3"/>
@@ -4887,7 +4973,7 @@
       <w:r>
         <w:t xml:space="preserve"> </w:t>
       </w:r>
-      <w:hyperlink r:id="rId114">
+      <w:hyperlink r:id="rId118">
         <w:r>
           <w:rPr>
             <w:rStyle w:val="Hyperlink"/>
@@ -4901,7 +4987,7 @@
       <w:r>
         <w:t xml:space="preserve"> </w:t>
       </w:r>
-      <w:hyperlink r:id="rId60">
+      <w:hyperlink r:id="rId64">
         <w:r>
           <w:rPr>
             <w:rStyle w:val="Hyperlink"/>
@@ -4915,7 +5001,7 @@
       <w:r>
         <w:t xml:space="preserve"> </w:t>
       </w:r>
-      <w:hyperlink r:id="rId115">
+      <w:hyperlink r:id="rId119">
         <w:r>
           <w:rPr>
             <w:rStyle w:val="Hyperlink"/>
@@ -4944,7 +5030,7 @@
       <w:r>
         <w:t xml:space="preserve"> </w:t>
       </w:r>
-      <w:hyperlink r:id="rId115">
+      <w:hyperlink r:id="rId119">
         <w:r>
           <w:rPr>
             <w:rStyle w:val="Hyperlink"/>
@@ -4988,7 +5074,7 @@
       <w:r>
         <w:t xml:space="preserve"> </w:t>
       </w:r>
-      <w:hyperlink r:id="rId114">
+      <w:hyperlink r:id="rId118">
         <w:r>
           <w:rPr>
             <w:rStyle w:val="Hyperlink"/>
@@ -5005,7 +5091,7 @@
       <w:r>
         <w:t xml:space="preserve"> </w:t>
       </w:r>
-      <w:hyperlink r:id="rId115">
+      <w:hyperlink r:id="rId119">
         <w:r>
           <w:rPr>
             <w:rStyle w:val="Hyperlink"/>
@@ -5031,7 +5117,7 @@
       <w:r>
         <w:t xml:space="preserve"> </w:t>
       </w:r>
-      <w:hyperlink r:id="rId116">
+      <w:hyperlink r:id="rId120">
         <w:r>
           <w:rPr>
             <w:rStyle w:val="Hyperlink"/>
@@ -5100,7 +5186,7 @@
         <w:t xml:space="preserve">requires breakthroughs that remain elusive even for expert programmers using today’s AI tools.</w:t>
       </w:r>
     </w:p>
-    <w:bookmarkStart w:id="117" w:name="additional-entities-5"/>
+    <w:bookmarkStart w:id="121" w:name="additional-entities-5"/>
     <w:p>
       <w:pPr>
         <w:pStyle w:val="Heading4"/>
@@ -5149,9 +5235,9 @@
         <w:t xml:space="preserve">Universal Constructor | Foundational Research | 65% | N/A | A Universal Constructor would be a programmable machine that can build virtually anything permitted by physics—including copies of itself—by assembling matter at the molecular level. This would eliminate traditional manufacturing bottlenecks, supply chains, and most physical labor, potentially solving resource scarcity by making any designed object as cheap to produce as any other. The technology doesn’t exist yet, but its anticipated arrival is already shaping debates about automation, economic transformation, and the physical limits of what humanity can build. |</w:t>
       </w:r>
     </w:p>
-    <w:bookmarkEnd w:id="117"/>
-    <w:bookmarkEnd w:id="118"/>
-    <w:bookmarkStart w:id="119" w:name="markets-incentive-systems"/>
+    <w:bookmarkEnd w:id="121"/>
+    <w:bookmarkEnd w:id="122"/>
+    <w:bookmarkStart w:id="123" w:name="markets-incentive-systems"/>
     <w:p>
       <w:pPr>
         <w:pStyle w:val="Heading3"/>
@@ -5180,8 +5266,8 @@
         <w:t xml:space="preserve">through systems where participants bet their own credibility or money, theoretically forcing honesty and punishing motivated reasoning in ways traditional governance and reputation systems cannot. What unites them is the belief that the right price signals—whether for predictions, policies, or peer contributions—can coordinate human behavior more efficiently than committees, votes, or informal social norms.</w:t>
       </w:r>
     </w:p>
-    <w:bookmarkEnd w:id="119"/>
-    <w:bookmarkStart w:id="127" w:name="prediction-reputation-markets"/>
+    <w:bookmarkEnd w:id="123"/>
+    <w:bookmarkStart w:id="131" w:name="prediction-reputation-markets"/>
     <w:p>
       <w:pPr>
         <w:pStyle w:val="Heading3"/>
@@ -5251,7 +5337,7 @@
       <w:r>
         <w:t xml:space="preserve"> </w:t>
       </w:r>
-      <w:hyperlink r:id="rId120">
+      <w:hyperlink r:id="rId124">
         <w:r>
           <w:rPr>
             <w:rStyle w:val="Hyperlink"/>
@@ -5268,7 +5354,7 @@
       <w:r>
         <w:t xml:space="preserve"> </w:t>
       </w:r>
-      <w:hyperlink r:id="rId47">
+      <w:hyperlink r:id="rId51">
         <w:r>
           <w:rPr>
             <w:rStyle w:val="Hyperlink"/>
@@ -5285,7 +5371,7 @@
       <w:r>
         <w:t xml:space="preserve"> </w:t>
       </w:r>
-      <w:hyperlink r:id="rId121">
+      <w:hyperlink r:id="rId125">
         <w:r>
           <w:rPr>
             <w:rStyle w:val="Hyperlink"/>
@@ -5302,7 +5388,7 @@
       <w:r>
         <w:t xml:space="preserve"> </w:t>
       </w:r>
-      <w:hyperlink r:id="rId87">
+      <w:hyperlink r:id="rId91">
         <w:r>
           <w:rPr>
             <w:rStyle w:val="Hyperlink"/>
@@ -5319,7 +5405,7 @@
       <w:r>
         <w:t xml:space="preserve"> </w:t>
       </w:r>
-      <w:hyperlink r:id="rId122">
+      <w:hyperlink r:id="rId126">
         <w:r>
           <w:rPr>
             <w:rStyle w:val="Hyperlink"/>
@@ -5336,7 +5422,7 @@
       <w:r>
         <w:t xml:space="preserve"> </w:t>
       </w:r>
-      <w:hyperlink r:id="rId123">
+      <w:hyperlink r:id="rId127">
         <w:r>
           <w:rPr>
             <w:rStyle w:val="Hyperlink"/>
@@ -5371,7 +5457,7 @@
       <w:r>
         <w:t xml:space="preserve"> </w:t>
       </w:r>
-      <w:hyperlink r:id="rId124">
+      <w:hyperlink r:id="rId128">
         <w:r>
           <w:rPr>
             <w:rStyle w:val="Hyperlink"/>
@@ -5388,7 +5474,7 @@
       <w:r>
         <w:t xml:space="preserve"> </w:t>
       </w:r>
-      <w:hyperlink r:id="rId88">
+      <w:hyperlink r:id="rId92">
         <w:r>
           <w:rPr>
             <w:rStyle w:val="Hyperlink"/>
@@ -5405,7 +5491,7 @@
       <w:r>
         <w:t xml:space="preserve"> </w:t>
       </w:r>
-      <w:hyperlink r:id="rId125">
+      <w:hyperlink r:id="rId129">
         <w:r>
           <w:rPr>
             <w:rStyle w:val="Hyperlink"/>
@@ -5438,7 +5524,7 @@
         <w:t xml:space="preserve">The oracle problem is fundamental: how do you reliably get supply chain data on-chain when most corporate reporting is self-certified and unverifiable? Regulatory barriers loom large — the CFTC’s 2024 actions show prediction markets remain legally fraught, and applying them to corporate reputation raises securities law concerns no one has resolved. Goodhart’s Law haunts the design: any reputation metric that becomes a target will be gamed, and we lack proven defenses against sophisticated adversarial manipulation. Most critically, reputation scores need teeth — affecting chip access or financing terms — which demands buy-in from powerful incumbents who currently benefit from opacity. The coordination problem may be harder than the technical one.</w:t>
       </w:r>
     </w:p>
-    <w:bookmarkStart w:id="126" w:name="additional-entities-6"/>
+    <w:bookmarkStart w:id="130" w:name="additional-entities-6"/>
     <w:p>
       <w:pPr>
         <w:pStyle w:val="Heading4"/>
@@ -5492,9 +5578,9 @@
         <w:t xml:space="preserve">—though critics worry that market manipulation, insufficient liquidity, and deep uncertainty about causal mechanisms could make it worse than democracy’s familiar failures. |</w:t>
       </w:r>
     </w:p>
-    <w:bookmarkEnd w:id="126"/>
-    <w:bookmarkEnd w:id="127"/>
-    <w:bookmarkStart w:id="128" w:name="science-discovery"/>
+    <w:bookmarkEnd w:id="130"/>
+    <w:bookmarkEnd w:id="131"/>
+    <w:bookmarkStart w:id="132" w:name="science-discovery"/>
     <w:p>
       <w:pPr>
         <w:pStyle w:val="Heading3"/>
@@ -5511,8 +5597,8 @@
         <w:t xml:space="preserve">These entities share a common thrust: automating, accelerating, or fundamentally restructuring how scientific knowledge is created, validated, and shared. They range from practical infrastructure—publishing systems that serve AI researchers directly, or protein design platforms targeting real-world problems—to more speculative ventures that reimagine science itself, like AI that discovers patterns without human-legible theory or experimental platforms probing life’s origins. Collectively, they reveal a field grappling with whether tomorrow’s science will simply be faster, or whether it will become something categorically different—machine-readable, massively collaborative, and potentially illegible to human scientists.</w:t>
       </w:r>
     </w:p>
-    <w:bookmarkEnd w:id="128"/>
-    <w:bookmarkStart w:id="142" w:name="X22d70bab2998e6cf16cfaa2a9c5d454ebee9269"/>
+    <w:bookmarkEnd w:id="132"/>
+    <w:bookmarkStart w:id="146" w:name="X22d70bab2998e6cf16cfaa2a9c5d454ebee9269"/>
     <w:p>
       <w:pPr>
         <w:pStyle w:val="Heading3"/>
@@ -5582,7 +5668,7 @@
       <w:r>
         <w:t xml:space="preserve"> </w:t>
       </w:r>
-      <w:hyperlink r:id="rId129">
+      <w:hyperlink r:id="rId133">
         <w:r>
           <w:rPr>
             <w:rStyle w:val="Hyperlink"/>
@@ -5599,7 +5685,7 @@
       <w:r>
         <w:t xml:space="preserve"> </w:t>
       </w:r>
-      <w:hyperlink r:id="rId61">
+      <w:hyperlink r:id="rId65">
         <w:r>
           <w:rPr>
             <w:rStyle w:val="Hyperlink"/>
@@ -5616,7 +5702,7 @@
       <w:r>
         <w:t xml:space="preserve"> </w:t>
       </w:r>
-      <w:hyperlink r:id="rId130">
+      <w:hyperlink r:id="rId134">
         <w:r>
           <w:rPr>
             <w:rStyle w:val="Hyperlink"/>
@@ -5633,7 +5719,7 @@
       <w:r>
         <w:t xml:space="preserve"> </w:t>
       </w:r>
-      <w:hyperlink r:id="rId131">
+      <w:hyperlink r:id="rId135">
         <w:r>
           <w:rPr>
             <w:rStyle w:val="Hyperlink"/>
@@ -5650,7 +5736,7 @@
       <w:r>
         <w:t xml:space="preserve"> </w:t>
       </w:r>
-      <w:hyperlink r:id="rId132">
+      <w:hyperlink r:id="rId136">
         <w:r>
           <w:rPr>
             <w:rStyle w:val="Hyperlink"/>
@@ -5667,7 +5753,7 @@
       <w:r>
         <w:t xml:space="preserve"> </w:t>
       </w:r>
-      <w:hyperlink r:id="rId133">
+      <w:hyperlink r:id="rId137">
         <w:r>
           <w:rPr>
             <w:rStyle w:val="Hyperlink"/>
@@ -5684,7 +5770,7 @@
       <w:r>
         <w:t xml:space="preserve"> </w:t>
       </w:r>
-      <w:hyperlink r:id="rId134">
+      <w:hyperlink r:id="rId138">
         <w:r>
           <w:rPr>
             <w:rStyle w:val="Hyperlink"/>
@@ -5701,7 +5787,7 @@
       <w:r>
         <w:t xml:space="preserve"> </w:t>
       </w:r>
-      <w:hyperlink r:id="rId135">
+      <w:hyperlink r:id="rId139">
         <w:r>
           <w:rPr>
             <w:rStyle w:val="Hyperlink"/>
@@ -5730,7 +5816,7 @@
       <w:r>
         <w:t xml:space="preserve"> </w:t>
       </w:r>
-      <w:hyperlink r:id="rId136">
+      <w:hyperlink r:id="rId140">
         <w:r>
           <w:rPr>
             <w:rStyle w:val="Hyperlink"/>
@@ -5747,7 +5833,7 @@
       <w:r>
         <w:t xml:space="preserve"> </w:t>
       </w:r>
-      <w:hyperlink r:id="rId137">
+      <w:hyperlink r:id="rId141">
         <w:r>
           <w:rPr>
             <w:rStyle w:val="Hyperlink"/>
@@ -5764,7 +5850,7 @@
       <w:r>
         <w:t xml:space="preserve"> </w:t>
       </w:r>
-      <w:hyperlink r:id="rId138">
+      <w:hyperlink r:id="rId142">
         <w:r>
           <w:rPr>
             <w:rStyle w:val="Hyperlink"/>
@@ -5781,7 +5867,7 @@
       <w:r>
         <w:t xml:space="preserve"> </w:t>
       </w:r>
-      <w:hyperlink r:id="rId139">
+      <w:hyperlink r:id="rId143">
         <w:r>
           <w:rPr>
             <w:rStyle w:val="Hyperlink"/>
@@ -5795,7 +5881,7 @@
       <w:r>
         <w:t xml:space="preserve"> </w:t>
       </w:r>
-      <w:hyperlink r:id="rId140">
+      <w:hyperlink r:id="rId144">
         <w:r>
           <w:rPr>
             <w:rStyle w:val="Hyperlink"/>
@@ -5812,7 +5898,7 @@
       <w:r>
         <w:t xml:space="preserve"> </w:t>
       </w:r>
-      <w:hyperlink r:id="rId141">
+      <w:hyperlink r:id="rId145">
         <w:r>
           <w:rPr>
             <w:rStyle w:val="Hyperlink"/>
@@ -5857,8 +5943,8 @@
         <w:t xml:space="preserve">for tenure or funding?</w:t>
       </w:r>
     </w:p>
-    <w:bookmarkEnd w:id="142"/>
-    <w:bookmarkStart w:id="149" w:name="universal-ai-learning-uncommons-ualu"/>
+    <w:bookmarkEnd w:id="146"/>
+    <w:bookmarkStart w:id="153" w:name="universal-ai-learning-uncommons-ualu"/>
     <w:p>
       <w:pPr>
         <w:pStyle w:val="Heading3"/>
@@ -5928,7 +6014,7 @@
       <w:r>
         <w:t xml:space="preserve"> </w:t>
       </w:r>
-      <w:hyperlink r:id="rId116">
+      <w:hyperlink r:id="rId120">
         <w:r>
           <w:rPr>
             <w:rStyle w:val="Hyperlink"/>
@@ -5945,7 +6031,7 @@
       <w:r>
         <w:t xml:space="preserve"> </w:t>
       </w:r>
-      <w:hyperlink r:id="rId51">
+      <w:hyperlink r:id="rId55">
         <w:r>
           <w:rPr>
             <w:rStyle w:val="Hyperlink"/>
@@ -5962,7 +6048,7 @@
       <w:r>
         <w:t xml:space="preserve"> </w:t>
       </w:r>
-      <w:hyperlink r:id="rId143">
+      <w:hyperlink r:id="rId147">
         <w:r>
           <w:rPr>
             <w:rStyle w:val="Hyperlink"/>
@@ -5979,7 +6065,7 @@
       <w:r>
         <w:t xml:space="preserve"> </w:t>
       </w:r>
-      <w:hyperlink r:id="rId144">
+      <w:hyperlink r:id="rId148">
         <w:r>
           <w:rPr>
             <w:rStyle w:val="Hyperlink"/>
@@ -5996,7 +6082,7 @@
       <w:r>
         <w:t xml:space="preserve"> </w:t>
       </w:r>
-      <w:hyperlink r:id="rId145">
+      <w:hyperlink r:id="rId149">
         <w:r>
           <w:rPr>
             <w:rStyle w:val="Hyperlink"/>
@@ -6013,7 +6099,7 @@
       <w:r>
         <w:t xml:space="preserve"> </w:t>
       </w:r>
-      <w:hyperlink r:id="rId59">
+      <w:hyperlink r:id="rId63">
         <w:r>
           <w:rPr>
             <w:rStyle w:val="Hyperlink"/>
@@ -6030,7 +6116,7 @@
       <w:r>
         <w:t xml:space="preserve"> </w:t>
       </w:r>
-      <w:hyperlink r:id="rId146">
+      <w:hyperlink r:id="rId150">
         <w:r>
           <w:rPr>
             <w:rStyle w:val="Hyperlink"/>
@@ -6047,7 +6133,7 @@
       <w:r>
         <w:t xml:space="preserve"> </w:t>
       </w:r>
-      <w:hyperlink r:id="rId147">
+      <w:hyperlink r:id="rId151">
         <w:r>
           <w:rPr>
             <w:rStyle w:val="Hyperlink"/>
@@ -6076,7 +6162,7 @@
       <w:r>
         <w:t xml:space="preserve">The concept emerges from community governance experiments in both tech (</w:t>
       </w:r>
-      <w:hyperlink r:id="rId90">
+      <w:hyperlink r:id="rId94">
         <w:r>
           <w:rPr>
             <w:rStyle w:val="Hyperlink"/>
@@ -6090,7 +6176,7 @@
       <w:r>
         <w:t xml:space="preserve"> </w:t>
       </w:r>
-      <w:hyperlink r:id="rId88">
+      <w:hyperlink r:id="rId92">
         <w:r>
           <w:rPr>
             <w:rStyle w:val="Hyperlink"/>
@@ -6107,7 +6193,7 @@
       <w:r>
         <w:t xml:space="preserve"> </w:t>
       </w:r>
-      <w:hyperlink r:id="rId94">
+      <w:hyperlink r:id="rId98">
         <w:r>
           <w:rPr>
             <w:rStyle w:val="Hyperlink"/>
@@ -6140,7 +6226,7 @@
         <w:t xml:space="preserve">The central paradox: coordinating between AI researchers, indigenous elders, ethicists, and diverse learners requires bridging radically different epistemological frameworks and technological literacy levels—a governance challenge no existing platform has solved at scale. How do you ensure quality and accuracy across hundreds of community contexts without centralized control? Who pays for ongoing infrastructure maintenance when community-governed commons lack corporate revenue models and grant funding is short-term? Can volunteer capacity handle the continuous auditing needed for pedagogically sound, culturally appropriate, technically accurate content? And most fundamentally: can a truly federated system resist eventual capture by well-resourced actors who can afford sustained participation while grassroots communities cannot?</w:t>
       </w:r>
     </w:p>
-    <w:bookmarkStart w:id="148" w:name="additional-entities-7"/>
+    <w:bookmarkStart w:id="152" w:name="additional-entities-7"/>
     <w:p>
       <w:pPr>
         <w:pStyle w:val="Heading4"/>
@@ -6197,9 +6283,9 @@
         <w:t xml:space="preserve">Origin of Life Experimental Platform | Early Demonstrations | 50% | 66% | Scientists don’t know how life began, and current experiments test only a tiny fraction of possible chemical pathways one at a time. An Origin of Life Experimental Platform would use robots and AI to systematically search millions of molecular combinations, treating life’s emergence as a solvable physics problem rather than a historical mystery. This matters because discovering how chemistry spontaneously organizes into biology could unlock not just our origins, but principles for engineering entirely new forms of life—with profound implications for synthetic biology, planetary science, and our search for life beyond Earth. |</w:t>
       </w:r>
     </w:p>
-    <w:bookmarkEnd w:id="148"/>
-    <w:bookmarkEnd w:id="149"/>
-    <w:bookmarkStart w:id="150" w:name="truth-epistemic-infrastructure"/>
+    <w:bookmarkEnd w:id="152"/>
+    <w:bookmarkEnd w:id="153"/>
+    <w:bookmarkStart w:id="154" w:name="truth-epistemic-infrastructure"/>
     <w:p>
       <w:pPr>
         <w:pStyle w:val="Heading3"/>
@@ -6216,8 +6302,8 @@
         <w:t xml:space="preserve">These systems share a conviction that AI-generated content and algorithmic personalization have fundamentally broken our ability to agree on what’s true—and that we need new technical infrastructure, not just better moderation, to fix it. They propose mechanisms ranging from cryptographic proof systems to AI-enhanced reasoning tools that would make facts verifiable, arguments traceable, and epistemological processes transparent. What unites them is the belief that trust at scale requires architecture: that we can engineer our way to better collective sense-making through systems that constrain manipulation, surface disagreement productively, and make the provenance of claims auditable.</w:t>
       </w:r>
     </w:p>
-    <w:bookmarkEnd w:id="150"/>
-    <w:bookmarkStart w:id="153" w:name="epistemic-stack"/>
+    <w:bookmarkEnd w:id="154"/>
+    <w:bookmarkStart w:id="157" w:name="epistemic-stack"/>
     <w:p>
       <w:pPr>
         <w:pStyle w:val="Heading3"/>
@@ -6287,7 +6373,7 @@
       <w:r>
         <w:t xml:space="preserve"> </w:t>
       </w:r>
-      <w:hyperlink r:id="rId129">
+      <w:hyperlink r:id="rId133">
         <w:r>
           <w:rPr>
             <w:rStyle w:val="Hyperlink"/>
@@ -6304,7 +6390,7 @@
       <w:r>
         <w:t xml:space="preserve"> </w:t>
       </w:r>
-      <w:hyperlink r:id="rId133">
+      <w:hyperlink r:id="rId137">
         <w:r>
           <w:rPr>
             <w:rStyle w:val="Hyperlink"/>
@@ -6321,7 +6407,7 @@
       <w:r>
         <w:t xml:space="preserve"> </w:t>
       </w:r>
-      <w:hyperlink r:id="rId135">
+      <w:hyperlink r:id="rId139">
         <w:r>
           <w:rPr>
             <w:rStyle w:val="Hyperlink"/>
@@ -6353,7 +6439,7 @@
       <w:r>
         <w:t xml:space="preserve"> </w:t>
       </w:r>
-      <w:hyperlink r:id="rId61">
+      <w:hyperlink r:id="rId65">
         <w:r>
           <w:rPr>
             <w:rStyle w:val="Hyperlink"/>
@@ -6370,7 +6456,7 @@
       <w:r>
         <w:t xml:space="preserve"> </w:t>
       </w:r>
-      <w:hyperlink r:id="rId138">
+      <w:hyperlink r:id="rId142">
         <w:r>
           <w:rPr>
             <w:rStyle w:val="Hyperlink"/>
@@ -6387,7 +6473,7 @@
       <w:r>
         <w:t xml:space="preserve"> </w:t>
       </w:r>
-      <w:hyperlink r:id="rId139">
+      <w:hyperlink r:id="rId143">
         <w:r>
           <w:rPr>
             <w:rStyle w:val="Hyperlink"/>
@@ -6401,7 +6487,7 @@
       <w:r>
         <w:t xml:space="preserve"> </w:t>
       </w:r>
-      <w:hyperlink r:id="rId137">
+      <w:hyperlink r:id="rId141">
         <w:r>
           <w:rPr>
             <w:rStyle w:val="Hyperlink"/>
@@ -6418,7 +6504,7 @@
       <w:r>
         <w:t xml:space="preserve"> </w:t>
       </w:r>
-      <w:hyperlink r:id="rId151">
+      <w:hyperlink r:id="rId155">
         <w:r>
           <w:rPr>
             <w:rStyle w:val="Hyperlink"/>
@@ -6451,7 +6537,7 @@
         <w:t xml:space="preserve">The hardest challenge isn’t technical—it’s semantic and institutional. Can AI systems reliably determine whether two claims genuinely support or contradict each other across disciplines? Current NLP struggles with nuanced reasoning. Will researchers adopt structured metadata standards when publication incentives reward speed over transparency? Who decides how credibility scores are calculated, and can such a system avoid becoming a weapon for gatekeeping heterodox ideas? Finally, building cross-platform knowledge infrastructure requires coordination mechanisms that don’t yet exist—someone must solve the governance problem before solving the technology problem.</w:t>
       </w:r>
     </w:p>
-    <w:bookmarkStart w:id="152" w:name="additional-entities-8"/>
+    <w:bookmarkStart w:id="156" w:name="additional-entities-8"/>
     <w:p>
       <w:pPr>
         <w:pStyle w:val="Heading4"/>
@@ -6528,402 +6614,402 @@
         <w:t xml:space="preserve">that work at machine speed. Without this, we risk fragmenting into incompatible realities where coordination on shared problems becomes impossible. |</w:t>
       </w:r>
     </w:p>
-    <w:bookmarkEnd w:id="152"/>
-    <w:bookmarkEnd w:id="153"/>
-    <w:bookmarkEnd w:id="154"/>
-    <w:bookmarkStart w:id="155" w:name="conclusion"/>
-    <w:p>
-      <w:pPr>
-        <w:pStyle w:val="Heading2"/>
-      </w:pPr>
-      <w:r>
-        <w:t xml:space="preserve">Conclusion</w:t>
-      </w:r>
-    </w:p>
-    <w:p>
-      <w:pPr>
-        <w:pStyle w:val="FirstParagraph"/>
-      </w:pPr>
-      <w:r>
-        <w:t xml:space="preserve">The 39 hyper-entities identified in this report represent a curated map of futures that are already shaping the present. They are not predictions — they are coordination attractors, systems around which investment, research, and narrative are already forming even before the first prototype exists. What makes them worth attending to now is precisely that earliness: the decisions made in the next five to ten years about which of these systems to fund, govern, and build will determine whether the technologies of the 2030s and 2040s concentrate power or distribute it, protect human agency or erode it, accelerate beneficial futures or foreclose them.</w:t>
-      </w:r>
-    </w:p>
-    <w:p>
-      <w:pPr>
-        <w:pStyle w:val="BodyText"/>
-      </w:pPr>
-      <w:r>
-        <w:t xml:space="preserve">For funders and policymakers, the key question is not</w:t>
-      </w:r>
-      <w:r>
-        <w:t xml:space="preserve"> </w:t>
-      </w:r>
-      <w:r>
-        <w:t xml:space="preserve">“what is the most powerful technology on the horizon?”</w:t>
-      </w:r>
-      <w:r>
-        <w:t xml:space="preserve"> </w:t>
-      </w:r>
-      <w:r>
-        <w:t xml:space="preserve">Power is not scarce in current technology development — attention and capital are already flowing toward the most transformative systems. The question is: what infrastructure ensures that powerful technologies serve broad human interests rather than narrow ones? Several patterns in this data are striking. Epistemic infrastructure — systems for verifying truth, enhancing collective reasoning, and making knowledge legible — is chronically underfunded relative to its importance. Projects like the Epistemic Stack, Automated Scientific Publishing for Machine Consumers, and AI-Assisted Epistemological Enhancement collectively address the question of whether humanity retains the shared capacity to reason well as AI systems proliferate. Their combined annual funding likely amounts to what a single AI lab spends in a few weeks. Energy systems, by contrast, show the strongest d/acc alignment in our data: Decentralized Adaptive Energy Networks, Deep Fission Micro Nuclear Reactors, and related technologies consistently score high on both transformative potential and values alignment — suggesting that the energy transition, if done right, could be among the most broadly beneficial technological shifts of this century. Governance tools and coordination protocols tend to have the longest time horizons but the highest systemic leverage: Competitive Governance Protocol Stacks, Futarchy, and Global Deliberation systems could reshape who gets to make consequential decisions — but they require sustained institutional investment on timescales that most funders find uncomfortable.</w:t>
-      </w:r>
-    </w:p>
-    <w:p>
-      <w:pPr>
-        <w:pStyle w:val="BodyText"/>
-      </w:pPr>
-      <w:r>
-        <w:t xml:space="preserve">The maturity distribution tells its own story. Of 39 entities, only 2 are near deployment, 20 are in early demonstrations, and 11 remain in foundational research. This is not a list of things almost ready to ship — it is a list of things that need patient capital, cross-disciplinary collaboration, and regulatory frameworks designed for experimentation rather than premature standardization. The window for shaping these systems is open now, and it will not remain open indefinitely. Once infrastructure standards calcify around centralized control, once regulatory frameworks cement incumbent advantages, once public narrative settles on a narrow vision of which futures are possible — the range of available paths narrows dramatically.</w:t>
-      </w:r>
-    </w:p>
-    <w:p>
-      <w:pPr>
-        <w:pStyle w:val="BodyText"/>
-      </w:pPr>
-      <w:r>
-        <w:t xml:space="preserve">What can you do with this information? If you are a funder, the undervalued shortlist in this report is a starting point: Chemputing, the Epistemic Stack, LexCommons, the Conflict De-escalation Protocol, and Gevulot all score well on our framework while receiving disproportionately little attention. More broadly, consider whether your portfolio has exposure to infrastructure that works across many possible futures, not just the ones currently receiving the most hype. If you are a policymaker, the entities in the upper-right quadrant of the scatter plot — high technology impact, strong d/acc alignment — represent the systems most worth building regulatory runway for today, before they are large enough to attract the incumbent opposition that typically slows good governance. If you are a researcher or technologist, the Open Questions sections throughout this report identify genuine frontiers: places where the field lacks basic scientific understanding, where governance frameworks don’t yet exist, or where the coordination problem is more tractable than the technical one.</w:t>
-      </w:r>
-    </w:p>
-    <w:p>
-      <w:pPr>
-        <w:pStyle w:val="BodyText"/>
-      </w:pPr>
-      <w:r>
-        <w:t xml:space="preserve">This research is a first pass, not a final map. The pipeline that produced it — 108 source documents, 300+ candidate systems, three-stage scoring, independent curation — is designed to be repeatable and extensible. Future iterations should expand the source corpus to include non-English discourse communities, incorporate structured expert elicitation alongside automated scoring, and track entities longitudinally to see which ones move from foundational research toward deployment. The goal is not to produce a single authoritative ranking but to build a shared language for talking about which futures are forming, which deserve more resources, and how the choices we make today are constraining or expanding the range of tomorrow. The 39 hyper-entities in this report are an invitation to that conversation.</w:t>
-      </w:r>
-    </w:p>
-    <w:bookmarkEnd w:id="155"/>
-    <w:bookmarkStart w:id="156" w:name="appendix-full-scoring-tables"/>
-    <w:p>
-      <w:pPr>
-        <w:pStyle w:val="Heading2"/>
-      </w:pPr>
-      <w:r>
-        <w:t xml:space="preserve">Appendix: Full Scoring Tables</w:t>
-      </w:r>
-    </w:p>
-    <w:p>
-      <w:pPr>
-        <w:pStyle w:val="FirstParagraph"/>
-      </w:pPr>
-      <w:r>
-        <w:t xml:space="preserve">Entity | Stage 1 | Tech Impact | d/acc | Maturity | Group |</w:t>
-      </w:r>
-    </w:p>
-    <w:p>
-      <w:pPr>
-        <w:pStyle w:val="BodyText"/>
-      </w:pPr>
-      <w:r>
-        <w:t xml:space="preserve">|——–|———|————-|——-|———-|——-|</w:t>
-      </w:r>
-    </w:p>
-    <w:p>
-      <w:pPr>
-        <w:pStyle w:val="BodyText"/>
-      </w:pPr>
-      <w:r>
-        <w:t xml:space="preserve">AI-Assisted Epistemological Enhancement System | 78% | 77% | 80% | Early Demonstrations | Truth &amp; Epistemic Infrastructure |</w:t>
-      </w:r>
-    </w:p>
-    <w:p>
-      <w:pPr>
-        <w:pStyle w:val="BodyText"/>
-      </w:pPr>
-      <w:r>
-        <w:t xml:space="preserve">Atheoretical Science AI | 56% | N/A | 65% | Foundational Research | Science &amp; Discovery |</w:t>
-      </w:r>
-    </w:p>
-    <w:p>
-      <w:pPr>
-        <w:pStyle w:val="BodyText"/>
-      </w:pPr>
-      <w:r>
-        <w:t xml:space="preserve">Atomically Precise Manufacturing / Molecular Machine Systems | 74% | 81% | 65% | Foundational Research | Manufacturing &amp; Matter |</w:t>
-      </w:r>
-    </w:p>
-    <w:p>
-      <w:pPr>
-        <w:pStyle w:val="BodyText"/>
-      </w:pPr>
-      <w:r>
-        <w:t xml:space="preserve">Automated Scientific Publishing Ecosystem for Machine Consumers | 74% | 86% | 90% | Early Demonstrations | Science &amp; Discovery |</w:t>
-      </w:r>
-    </w:p>
-    <w:p>
-      <w:pPr>
-        <w:pStyle w:val="BodyText"/>
-      </w:pPr>
-      <w:r>
-        <w:t xml:space="preserve">Chemputing (Chemical Computing) | 74% | 63% | 65% | Early Demonstrations | Manufacturing &amp; Matter |</w:t>
-      </w:r>
-    </w:p>
-    <w:p>
-      <w:pPr>
-        <w:pStyle w:val="BodyText"/>
-      </w:pPr>
-      <w:r>
-        <w:t xml:space="preserve">Climate Adaptation Jurisdictional Arbitrage | 70% | N/A | 80% | Early Demonstrations | Energy &amp; Infrastructure |</w:t>
-      </w:r>
-    </w:p>
-    <w:p>
-      <w:pPr>
-        <w:pStyle w:val="BodyText"/>
-      </w:pPr>
-      <w:r>
-        <w:t xml:space="preserve">Competitive Governance Protocol Stack | 85% | 81% | 90% | Early Demonstrations | Governance &amp; Collective Intelligence |</w:t>
-      </w:r>
-    </w:p>
-    <w:p>
-      <w:pPr>
-        <w:pStyle w:val="BodyText"/>
-      </w:pPr>
-      <w:r>
-        <w:t xml:space="preserve">Conflict De-escalation Protocol | 59% | N/A | 80% | Foundational Research | Governance &amp; Collective Intelligence |</w:t>
-      </w:r>
-    </w:p>
-    <w:p>
-      <w:pPr>
-        <w:pStyle w:val="BodyText"/>
-      </w:pPr>
-      <w:r>
-        <w:t xml:space="preserve">Decentralized Adaptive Energy Network | 67% | 73% | 90% | Scaling Challenges | Energy &amp; Infrastructure |</w:t>
-      </w:r>
-    </w:p>
-    <w:p>
-      <w:pPr>
-        <w:pStyle w:val="BodyText"/>
-      </w:pPr>
-      <w:r>
-        <w:t xml:space="preserve">Decentralized Scientific Collaboration Infrastructure | 85% | 76% | 90% | Scaling Challenges | Science &amp; Discovery |</w:t>
-      </w:r>
-    </w:p>
-    <w:p>
-      <w:pPr>
-        <w:pStyle w:val="BodyText"/>
-      </w:pPr>
-      <w:r>
-        <w:t xml:space="preserve">Deep Fision Micro Nuclear Reactors | 81% | 67% | 80% | Early Demonstrations | Energy &amp; Infrastructure |</w:t>
-      </w:r>
-    </w:p>
-    <w:p>
-      <w:pPr>
-        <w:pStyle w:val="BodyText"/>
-      </w:pPr>
-      <w:r>
-        <w:t xml:space="preserve">Digital Mind Governance Systems | 70% | 76% | 80% | Foundational Research | Mind, Brain &amp; Human Augmentation |</w:t>
-      </w:r>
-    </w:p>
-    <w:p>
-      <w:pPr>
-        <w:pStyle w:val="BodyText"/>
-      </w:pPr>
-      <w:r>
-        <w:t xml:space="preserve">Digital Twin Ecosystem | 70% | 79% | 75% | Scaling Challenges | Mind, Brain &amp; Human Augmentation |</w:t>
-      </w:r>
-    </w:p>
-    <w:p>
-      <w:pPr>
-        <w:pStyle w:val="BodyText"/>
-      </w:pPr>
-      <w:r>
-        <w:t xml:space="preserve">Distributed Zero-Knowledge Security Systems | 85% | 67% | 80% | Scaling Challenges | Truth &amp; Epistemic Infrastructure |</w:t>
-      </w:r>
-    </w:p>
-    <w:p>
-      <w:pPr>
-        <w:pStyle w:val="BodyText"/>
-      </w:pPr>
-      <w:r>
-        <w:t xml:space="preserve">EgoLets (Personal AI Assistants) | 78% | 69% | 75% | Early Demonstrations | AI &amp; Human Agency |</w:t>
-      </w:r>
-    </w:p>
-    <w:p>
-      <w:pPr>
-        <w:pStyle w:val="BodyText"/>
-      </w:pPr>
-      <w:r>
-        <w:t xml:space="preserve">Empathetic Neuro-AI Emotional Coaching System | 78% | 69% | 65% | Early Demonstrations | AI &amp; Human Agency |</w:t>
-      </w:r>
-    </w:p>
-    <w:p>
-      <w:pPr>
-        <w:pStyle w:val="BodyText"/>
-      </w:pPr>
-      <w:r>
-        <w:t xml:space="preserve">End-User Programming Ecosystem | 78% | 77% | 80% | Scaling Challenges | Manufacturing &amp; Matter |</w:t>
-      </w:r>
-    </w:p>
-    <w:p>
-      <w:pPr>
-        <w:pStyle w:val="BodyText"/>
-      </w:pPr>
-      <w:r>
-        <w:t xml:space="preserve">Epistemic Infrastructure for Truth Verification | 70% | 76% | 80% | Early Demonstrations | Truth &amp; Epistemic Infrastructure |</w:t>
-      </w:r>
-    </w:p>
-    <w:p>
-      <w:pPr>
-        <w:pStyle w:val="BodyText"/>
-      </w:pPr>
-      <w:r>
-        <w:t xml:space="preserve">Epistemic Stack | 70% | 63% | 85% | Early Demonstrations | Truth &amp; Epistemic Infrastructure |</w:t>
-      </w:r>
-    </w:p>
-    <w:p>
-      <w:pPr>
-        <w:pStyle w:val="BodyText"/>
-      </w:pPr>
-      <w:r>
-        <w:t xml:space="preserve">Expanded Moral Circle Technologies | 59% | N/A | 80% | Foundational Research | Ethics &amp; Moral Expansion |</w:t>
-      </w:r>
-    </w:p>
-    <w:p>
-      <w:pPr>
-        <w:pStyle w:val="BodyText"/>
-      </w:pPr>
-      <w:r>
-        <w:t xml:space="preserve">Fiduciary AI Assistance | 59% | N/A | 80% | Foundational Research | AI &amp; Human Agency |</w:t>
-      </w:r>
-    </w:p>
-    <w:p>
-      <w:pPr>
-        <w:pStyle w:val="BodyText"/>
-      </w:pPr>
-      <w:r>
-        <w:t xml:space="preserve">Futarchy (Governance by Prediction Markets) | 63% | N/A | 80% | Early Demonstrations | Markets &amp; Incentive Systems |</w:t>
-      </w:r>
-    </w:p>
-    <w:p>
-      <w:pPr>
-        <w:pStyle w:val="BodyText"/>
-      </w:pPr>
-      <w:r>
-        <w:t xml:space="preserve">Gevulot (Privacy Infrastructure) | 63% | N/A | 90% | Early Demonstrations | Governance &amp; Collective Intelligence |</w:t>
-      </w:r>
-    </w:p>
-    <w:p>
-      <w:pPr>
-        <w:pStyle w:val="BodyText"/>
-      </w:pPr>
-      <w:r>
-        <w:t xml:space="preserve">Global Deliberation Coordinator (GDaaS) | 70% | 74% | 75% | Early Demonstrations | Governance &amp; Collective Intelligence |</w:t>
-      </w:r>
-    </w:p>
-    <w:p>
-      <w:pPr>
-        <w:pStyle w:val="BodyText"/>
-      </w:pPr>
-      <w:r>
-        <w:t xml:space="preserve">Habermas Machines | 74% | 60% | 75% | Early Demonstrations | Governance &amp; Collective Intelligence |</w:t>
-      </w:r>
-    </w:p>
-    <w:p>
-      <w:pPr>
-        <w:pStyle w:val="BodyText"/>
-      </w:pPr>
-      <w:r>
-        <w:t xml:space="preserve">Human Superintelligence via Brain-Computer Interfaces (BCI) | 78% | 86% | 60% | Early Demonstrations | Mind, Brain &amp; Human Augmentation |</w:t>
-      </w:r>
-    </w:p>
-    <w:p>
-      <w:pPr>
-        <w:pStyle w:val="BodyText"/>
-      </w:pPr>
-      <w:r>
-        <w:t xml:space="preserve">Immune-Computer Interface | 74% | 83% | 65% | Early Demonstrations | Mind, Brain &amp; Human Augmentation |</w:t>
-      </w:r>
-    </w:p>
-    <w:p>
-      <w:pPr>
-        <w:pStyle w:val="BodyText"/>
-      </w:pPr>
-      <w:r>
-        <w:t xml:space="preserve">LexCommons | 81% | 81% | 90% | Foundational Research | Governance &amp; Collective Intelligence |</w:t>
-      </w:r>
-    </w:p>
-    <w:p>
-      <w:pPr>
-        <w:pStyle w:val="BodyText"/>
-      </w:pPr>
-      <w:r>
-        <w:t xml:space="preserve">Lifelong AI Guardians | 78% | 70% | 65% | Early Demonstrations | AI &amp; Human Agency |</w:t>
-      </w:r>
-    </w:p>
-    <w:p>
-      <w:pPr>
-        <w:pStyle w:val="BodyText"/>
-      </w:pPr>
-      <w:r>
-        <w:t xml:space="preserve">Mind Uploading Infrastructure | 78% | 80% | 40% | Foundational Research | Mind, Brain &amp; Human Augmentation |</w:t>
-      </w:r>
-    </w:p>
-    <w:p>
-      <w:pPr>
-        <w:pStyle w:val="BodyText"/>
-      </w:pPr>
-      <w:r>
-        <w:t xml:space="preserve">Moral Trade Civilization | 41% | N/A | 80% | Foundational Research | Ethics &amp; Moral Expansion |</w:t>
-      </w:r>
-    </w:p>
-    <w:p>
-      <w:pPr>
-        <w:pStyle w:val="BodyText"/>
-      </w:pPr>
-      <w:r>
-        <w:t xml:space="preserve">Origin of Life Experimental Platform | 74% | 66% | 50% | Early Demonstrations | Science &amp; Discovery |</w:t>
-      </w:r>
-    </w:p>
-    <w:p>
-      <w:pPr>
-        <w:pStyle w:val="BodyText"/>
-      </w:pPr>
-      <w:r>
-        <w:t xml:space="preserve">Protein Design for Global Challenges | 78% | 76% | 65% | Near Deployment | Science &amp; Discovery |</w:t>
-      </w:r>
-    </w:p>
-    <w:p>
-      <w:pPr>
-        <w:pStyle w:val="BodyText"/>
-      </w:pPr>
-      <w:r>
-        <w:t xml:space="preserve">Prediction &amp; Reputation Markets | 70% | 73% | 85% | Early Demonstrations | Markets &amp; Incentive Systems |</w:t>
-      </w:r>
-    </w:p>
-    <w:p>
-      <w:pPr>
-        <w:pStyle w:val="BodyText"/>
-      </w:pPr>
-      <w:r>
-        <w:t xml:space="preserve">Cross-Cultural Understanding Infrastructure (TLMs) | 81% | 76% | 80% | Near Deployment | Mind, Brain &amp; Human Augmentation |</w:t>
-      </w:r>
-    </w:p>
-    <w:p>
-      <w:pPr>
-        <w:pStyle w:val="BodyText"/>
-      </w:pPr>
-      <w:r>
-        <w:t xml:space="preserve">Universal AI Learning UnCommons (UALU) | 70% | 63% | 85% | Early Demonstrations | Science &amp; Discovery |</w:t>
-      </w:r>
-    </w:p>
-    <w:p>
-      <w:pPr>
-        <w:pStyle w:val="BodyText"/>
-      </w:pPr>
-      <w:r>
-        <w:t xml:space="preserve">Universal Constructor | 56% | N/A | 65% | Foundational Research | Manufacturing &amp; Matter |</w:t>
-      </w:r>
-    </w:p>
-    <w:p>
-      <w:pPr>
-        <w:pStyle w:val="BodyText"/>
-      </w:pPr>
-      <w:r>
-        <w:t xml:space="preserve">Whole Brain Emulation | 59% | N/A | 40% | Foundational Research | Mind, Brain &amp; Human Augmentation |</w:t>
-      </w:r>
-    </w:p>
     <w:bookmarkEnd w:id="156"/>
     <w:bookmarkEnd w:id="157"/>
+    <w:bookmarkEnd w:id="158"/>
+    <w:bookmarkStart w:id="159" w:name="conclusion"/>
+    <w:p>
+      <w:pPr>
+        <w:pStyle w:val="Heading2"/>
+      </w:pPr>
+      <w:r>
+        <w:t xml:space="preserve">Conclusion</w:t>
+      </w:r>
+    </w:p>
+    <w:p>
+      <w:pPr>
+        <w:pStyle w:val="FirstParagraph"/>
+      </w:pPr>
+      <w:r>
+        <w:t xml:space="preserve">The 39 hyper-entities identified in this report represent a curated map of futures that are already shaping the present. They are not predictions — they are coordination attractors, systems around which investment, research, and narrative are already forming even before the first prototype exists. What makes them worth attending to now is precisely that earliness: the decisions made in the next five to ten years about which of these systems to fund, govern, and build will determine whether the technologies of the 2030s and 2040s concentrate power or distribute it, protect human agency or erode it, accelerate beneficial futures or foreclose them.</w:t>
+      </w:r>
+    </w:p>
+    <w:p>
+      <w:pPr>
+        <w:pStyle w:val="BodyText"/>
+      </w:pPr>
+      <w:r>
+        <w:t xml:space="preserve">For funders and policymakers, the key question is not</w:t>
+      </w:r>
+      <w:r>
+        <w:t xml:space="preserve"> </w:t>
+      </w:r>
+      <w:r>
+        <w:t xml:space="preserve">“what is the most powerful technology on the horizon?”</w:t>
+      </w:r>
+      <w:r>
+        <w:t xml:space="preserve"> </w:t>
+      </w:r>
+      <w:r>
+        <w:t xml:space="preserve">Power is not scarce in current technology development — attention and capital are already flowing toward the most transformative systems. The question is: what infrastructure ensures that powerful technologies serve broad human interests rather than narrow ones? Several patterns in this data are striking. Epistemic infrastructure — systems for verifying truth, enhancing collective reasoning, and making knowledge legible — is chronically underfunded relative to its importance. Projects like the Epistemic Stack, Automated Scientific Publishing for Machine Consumers, and AI-Assisted Epistemological Enhancement collectively address the question of whether humanity retains the shared capacity to reason well as AI systems proliferate. Their combined annual funding likely amounts to what a single AI lab spends in a few weeks. Energy systems, by contrast, show the strongest d/acc alignment in our data: Decentralized Adaptive Energy Networks, Deep Fission Micro Nuclear Reactors, and related technologies consistently score high on both transformative potential and values alignment — suggesting that the energy transition, if done right, could be among the most broadly beneficial technological shifts of this century. Governance tools and coordination protocols tend to have the longest time horizons but the highest systemic leverage: Competitive Governance Protocol Stacks, Futarchy, and Global Deliberation systems could reshape who gets to make consequential decisions — but they require sustained institutional investment on timescales that most funders find uncomfortable.</w:t>
+      </w:r>
+    </w:p>
+    <w:p>
+      <w:pPr>
+        <w:pStyle w:val="BodyText"/>
+      </w:pPr>
+      <w:r>
+        <w:t xml:space="preserve">The maturity distribution tells its own story. Of 39 entities, only 2 are near deployment, 20 are in early demonstrations, and 11 remain in foundational research. This is not a list of things almost ready to ship — it is a list of things that need patient capital, cross-disciplinary collaboration, and regulatory frameworks designed for experimentation rather than premature standardization. The window for shaping these systems is open now, and it will not remain open indefinitely. Once infrastructure standards calcify around centralized control, once regulatory frameworks cement incumbent advantages, once public narrative settles on a narrow vision of which futures are possible — the range of available paths narrows dramatically.</w:t>
+      </w:r>
+    </w:p>
+    <w:p>
+      <w:pPr>
+        <w:pStyle w:val="BodyText"/>
+      </w:pPr>
+      <w:r>
+        <w:t xml:space="preserve">What can you do with this information? If you are a funder, the undervalued shortlist in this report is a starting point: Chemputing, the Epistemic Stack, LexCommons, the Conflict De-escalation Protocol, and Gevulot all score well on our framework while receiving disproportionately little attention. More broadly, consider whether your portfolio has exposure to infrastructure that works across many possible futures, not just the ones currently receiving the most hype. If you are a policymaker, the entities in the upper-right quadrant of the scatter plot — high technology impact, strong d/acc alignment — represent the systems most worth building regulatory runway for today, before they are large enough to attract the incumbent opposition that typically slows good governance. If you are a researcher or technologist, the Open Questions sections throughout this report identify genuine frontiers: places where the field lacks basic scientific understanding, where governance frameworks don’t yet exist, or where the coordination problem is more tractable than the technical one.</w:t>
+      </w:r>
+    </w:p>
+    <w:p>
+      <w:pPr>
+        <w:pStyle w:val="BodyText"/>
+      </w:pPr>
+      <w:r>
+        <w:t xml:space="preserve">This research is a first pass, not a final map. The pipeline that produced it — 108 source documents, 300+ candidate systems, three-stage scoring, independent curation — is designed to be repeatable and extensible. Future iterations should expand the source corpus to include non-English discourse communities, incorporate structured expert elicitation alongside automated scoring, and track entities longitudinally to see which ones move from foundational research toward deployment. The goal is not to produce a single authoritative ranking but to build a shared language for talking about which futures are forming, which deserve more resources, and how the choices we make today are constraining or expanding the range of tomorrow. The 39 hyper-entities in this report are an invitation to that conversation.</w:t>
+      </w:r>
+    </w:p>
+    <w:bookmarkEnd w:id="159"/>
+    <w:bookmarkStart w:id="160" w:name="appendix-full-scoring-tables"/>
+    <w:p>
+      <w:pPr>
+        <w:pStyle w:val="Heading2"/>
+      </w:pPr>
+      <w:r>
+        <w:t xml:space="preserve">Appendix: Full Scoring Tables</w:t>
+      </w:r>
+    </w:p>
+    <w:p>
+      <w:pPr>
+        <w:pStyle w:val="FirstParagraph"/>
+      </w:pPr>
+      <w:r>
+        <w:t xml:space="preserve">Entity | Stage 1 | Tech Impact | d/acc | Maturity | Group |</w:t>
+      </w:r>
+    </w:p>
+    <w:p>
+      <w:pPr>
+        <w:pStyle w:val="BodyText"/>
+      </w:pPr>
+      <w:r>
+        <w:t xml:space="preserve">|——–|———|————-|——-|———-|——-|</w:t>
+      </w:r>
+    </w:p>
+    <w:p>
+      <w:pPr>
+        <w:pStyle w:val="BodyText"/>
+      </w:pPr>
+      <w:r>
+        <w:t xml:space="preserve">AI-Assisted Epistemological Enhancement System | 78% | 77% | 80% | Early Demonstrations | Truth &amp; Epistemic Infrastructure |</w:t>
+      </w:r>
+    </w:p>
+    <w:p>
+      <w:pPr>
+        <w:pStyle w:val="BodyText"/>
+      </w:pPr>
+      <w:r>
+        <w:t xml:space="preserve">Atheoretical Science AI | 56% | N/A | 65% | Foundational Research | Science &amp; Discovery |</w:t>
+      </w:r>
+    </w:p>
+    <w:p>
+      <w:pPr>
+        <w:pStyle w:val="BodyText"/>
+      </w:pPr>
+      <w:r>
+        <w:t xml:space="preserve">Atomically Precise Manufacturing / Molecular Machine Systems | 74% | 81% | 65% | Foundational Research | Manufacturing &amp; Matter |</w:t>
+      </w:r>
+    </w:p>
+    <w:p>
+      <w:pPr>
+        <w:pStyle w:val="BodyText"/>
+      </w:pPr>
+      <w:r>
+        <w:t xml:space="preserve">Automated Scientific Publishing Ecosystem for Machine Consumers | 74% | 86% | 90% | Early Demonstrations | Science &amp; Discovery |</w:t>
+      </w:r>
+    </w:p>
+    <w:p>
+      <w:pPr>
+        <w:pStyle w:val="BodyText"/>
+      </w:pPr>
+      <w:r>
+        <w:t xml:space="preserve">Chemputing (Chemical Computing) | 74% | 63% | 65% | Early Demonstrations | Manufacturing &amp; Matter |</w:t>
+      </w:r>
+    </w:p>
+    <w:p>
+      <w:pPr>
+        <w:pStyle w:val="BodyText"/>
+      </w:pPr>
+      <w:r>
+        <w:t xml:space="preserve">Climate Adaptation Jurisdictional Arbitrage | 70% | N/A | 80% | Early Demonstrations | Energy &amp; Infrastructure |</w:t>
+      </w:r>
+    </w:p>
+    <w:p>
+      <w:pPr>
+        <w:pStyle w:val="BodyText"/>
+      </w:pPr>
+      <w:r>
+        <w:t xml:space="preserve">Competitive Governance Protocol Stack | 85% | 81% | 90% | Early Demonstrations | Governance &amp; Collective Intelligence |</w:t>
+      </w:r>
+    </w:p>
+    <w:p>
+      <w:pPr>
+        <w:pStyle w:val="BodyText"/>
+      </w:pPr>
+      <w:r>
+        <w:t xml:space="preserve">Conflict De-escalation Protocol | 59% | N/A | 80% | Foundational Research | Governance &amp; Collective Intelligence |</w:t>
+      </w:r>
+    </w:p>
+    <w:p>
+      <w:pPr>
+        <w:pStyle w:val="BodyText"/>
+      </w:pPr>
+      <w:r>
+        <w:t xml:space="preserve">Decentralized Adaptive Energy Network | 67% | 73% | 90% | Scaling Challenges | Energy &amp; Infrastructure |</w:t>
+      </w:r>
+    </w:p>
+    <w:p>
+      <w:pPr>
+        <w:pStyle w:val="BodyText"/>
+      </w:pPr>
+      <w:r>
+        <w:t xml:space="preserve">Decentralized Scientific Collaboration Infrastructure | 85% | 76% | 90% | Scaling Challenges | Science &amp; Discovery |</w:t>
+      </w:r>
+    </w:p>
+    <w:p>
+      <w:pPr>
+        <w:pStyle w:val="BodyText"/>
+      </w:pPr>
+      <w:r>
+        <w:t xml:space="preserve">Deep Fision Micro Nuclear Reactors | 81% | 67% | 80% | Early Demonstrations | Energy &amp; Infrastructure |</w:t>
+      </w:r>
+    </w:p>
+    <w:p>
+      <w:pPr>
+        <w:pStyle w:val="BodyText"/>
+      </w:pPr>
+      <w:r>
+        <w:t xml:space="preserve">Digital Mind Governance Systems | 70% | 76% | 80% | Foundational Research | Mind, Brain &amp; Human Augmentation |</w:t>
+      </w:r>
+    </w:p>
+    <w:p>
+      <w:pPr>
+        <w:pStyle w:val="BodyText"/>
+      </w:pPr>
+      <w:r>
+        <w:t xml:space="preserve">Digital Twin Ecosystem | 70% | 79% | 75% | Scaling Challenges | Mind, Brain &amp; Human Augmentation |</w:t>
+      </w:r>
+    </w:p>
+    <w:p>
+      <w:pPr>
+        <w:pStyle w:val="BodyText"/>
+      </w:pPr>
+      <w:r>
+        <w:t xml:space="preserve">Distributed Zero-Knowledge Security Systems | 85% | 67% | 80% | Scaling Challenges | Truth &amp; Epistemic Infrastructure |</w:t>
+      </w:r>
+    </w:p>
+    <w:p>
+      <w:pPr>
+        <w:pStyle w:val="BodyText"/>
+      </w:pPr>
+      <w:r>
+        <w:t xml:space="preserve">EgoLets (Personal AI Assistants) | 78% | 69% | 75% | Early Demonstrations | AI &amp; Human Agency |</w:t>
+      </w:r>
+    </w:p>
+    <w:p>
+      <w:pPr>
+        <w:pStyle w:val="BodyText"/>
+      </w:pPr>
+      <w:r>
+        <w:t xml:space="preserve">Empathetic Neuro-AI Emotional Coaching System | 78% | 69% | 65% | Early Demonstrations | AI &amp; Human Agency |</w:t>
+      </w:r>
+    </w:p>
+    <w:p>
+      <w:pPr>
+        <w:pStyle w:val="BodyText"/>
+      </w:pPr>
+      <w:r>
+        <w:t xml:space="preserve">End-User Programming Ecosystem | 78% | 77% | 80% | Scaling Challenges | Manufacturing &amp; Matter |</w:t>
+      </w:r>
+    </w:p>
+    <w:p>
+      <w:pPr>
+        <w:pStyle w:val="BodyText"/>
+      </w:pPr>
+      <w:r>
+        <w:t xml:space="preserve">Epistemic Infrastructure for Truth Verification | 70% | 76% | 80% | Early Demonstrations | Truth &amp; Epistemic Infrastructure |</w:t>
+      </w:r>
+    </w:p>
+    <w:p>
+      <w:pPr>
+        <w:pStyle w:val="BodyText"/>
+      </w:pPr>
+      <w:r>
+        <w:t xml:space="preserve">Epistemic Stack | 70% | 63% | 85% | Early Demonstrations | Truth &amp; Epistemic Infrastructure |</w:t>
+      </w:r>
+    </w:p>
+    <w:p>
+      <w:pPr>
+        <w:pStyle w:val="BodyText"/>
+      </w:pPr>
+      <w:r>
+        <w:t xml:space="preserve">Expanded Moral Circle Technologies | 59% | N/A | 80% | Foundational Research | Ethics &amp; Moral Expansion |</w:t>
+      </w:r>
+    </w:p>
+    <w:p>
+      <w:pPr>
+        <w:pStyle w:val="BodyText"/>
+      </w:pPr>
+      <w:r>
+        <w:t xml:space="preserve">Fiduciary AI Assistance | 59% | N/A | 80% | Foundational Research | AI &amp; Human Agency |</w:t>
+      </w:r>
+    </w:p>
+    <w:p>
+      <w:pPr>
+        <w:pStyle w:val="BodyText"/>
+      </w:pPr>
+      <w:r>
+        <w:t xml:space="preserve">Futarchy (Governance by Prediction Markets) | 63% | N/A | 80% | Early Demonstrations | Markets &amp; Incentive Systems |</w:t>
+      </w:r>
+    </w:p>
+    <w:p>
+      <w:pPr>
+        <w:pStyle w:val="BodyText"/>
+      </w:pPr>
+      <w:r>
+        <w:t xml:space="preserve">Gevulot (Privacy Infrastructure) | 63% | N/A | 90% | Early Demonstrations | Governance &amp; Collective Intelligence |</w:t>
+      </w:r>
+    </w:p>
+    <w:p>
+      <w:pPr>
+        <w:pStyle w:val="BodyText"/>
+      </w:pPr>
+      <w:r>
+        <w:t xml:space="preserve">Global Deliberation Coordinator (GDaaS) | 70% | 74% | 75% | Early Demonstrations | Governance &amp; Collective Intelligence |</w:t>
+      </w:r>
+    </w:p>
+    <w:p>
+      <w:pPr>
+        <w:pStyle w:val="BodyText"/>
+      </w:pPr>
+      <w:r>
+        <w:t xml:space="preserve">Habermas Machines | 74% | 60% | 75% | Early Demonstrations | Governance &amp; Collective Intelligence |</w:t>
+      </w:r>
+    </w:p>
+    <w:p>
+      <w:pPr>
+        <w:pStyle w:val="BodyText"/>
+      </w:pPr>
+      <w:r>
+        <w:t xml:space="preserve">Human Superintelligence via Brain-Computer Interfaces (BCI) | 78% | 86% | 60% | Early Demonstrations | Mind, Brain &amp; Human Augmentation |</w:t>
+      </w:r>
+    </w:p>
+    <w:p>
+      <w:pPr>
+        <w:pStyle w:val="BodyText"/>
+      </w:pPr>
+      <w:r>
+        <w:t xml:space="preserve">Immune-Computer Interface | 74% | 83% | 65% | Early Demonstrations | Mind, Brain &amp; Human Augmentation |</w:t>
+      </w:r>
+    </w:p>
+    <w:p>
+      <w:pPr>
+        <w:pStyle w:val="BodyText"/>
+      </w:pPr>
+      <w:r>
+        <w:t xml:space="preserve">LexCommons | 81% | 81% | 90% | Foundational Research | Governance &amp; Collective Intelligence |</w:t>
+      </w:r>
+    </w:p>
+    <w:p>
+      <w:pPr>
+        <w:pStyle w:val="BodyText"/>
+      </w:pPr>
+      <w:r>
+        <w:t xml:space="preserve">Lifelong AI Guardians | 78% | 70% | 65% | Early Demonstrations | AI &amp; Human Agency |</w:t>
+      </w:r>
+    </w:p>
+    <w:p>
+      <w:pPr>
+        <w:pStyle w:val="BodyText"/>
+      </w:pPr>
+      <w:r>
+        <w:t xml:space="preserve">Mind Uploading Infrastructure | 78% | 80% | 40% | Foundational Research | Mind, Brain &amp; Human Augmentation |</w:t>
+      </w:r>
+    </w:p>
+    <w:p>
+      <w:pPr>
+        <w:pStyle w:val="BodyText"/>
+      </w:pPr>
+      <w:r>
+        <w:t xml:space="preserve">Moral Trade Civilization | 41% | N/A | 80% | Foundational Research | Ethics &amp; Moral Expansion |</w:t>
+      </w:r>
+    </w:p>
+    <w:p>
+      <w:pPr>
+        <w:pStyle w:val="BodyText"/>
+      </w:pPr>
+      <w:r>
+        <w:t xml:space="preserve">Origin of Life Experimental Platform | 74% | 66% | 50% | Early Demonstrations | Science &amp; Discovery |</w:t>
+      </w:r>
+    </w:p>
+    <w:p>
+      <w:pPr>
+        <w:pStyle w:val="BodyText"/>
+      </w:pPr>
+      <w:r>
+        <w:t xml:space="preserve">Protein Design for Global Challenges | 78% | 76% | 65% | Near Deployment | Science &amp; Discovery |</w:t>
+      </w:r>
+    </w:p>
+    <w:p>
+      <w:pPr>
+        <w:pStyle w:val="BodyText"/>
+      </w:pPr>
+      <w:r>
+        <w:t xml:space="preserve">Prediction &amp; Reputation Markets | 70% | 73% | 85% | Early Demonstrations | Markets &amp; Incentive Systems |</w:t>
+      </w:r>
+    </w:p>
+    <w:p>
+      <w:pPr>
+        <w:pStyle w:val="BodyText"/>
+      </w:pPr>
+      <w:r>
+        <w:t xml:space="preserve">Cross-Cultural Understanding Infrastructure (TLMs) | 81% | 76% | 80% | Near Deployment | Mind, Brain &amp; Human Augmentation |</w:t>
+      </w:r>
+    </w:p>
+    <w:p>
+      <w:pPr>
+        <w:pStyle w:val="BodyText"/>
+      </w:pPr>
+      <w:r>
+        <w:t xml:space="preserve">Universal AI Learning UnCommons (UALU) | 70% | 63% | 85% | Early Demonstrations | Science &amp; Discovery |</w:t>
+      </w:r>
+    </w:p>
+    <w:p>
+      <w:pPr>
+        <w:pStyle w:val="BodyText"/>
+      </w:pPr>
+      <w:r>
+        <w:t xml:space="preserve">Universal Constructor | 56% | N/A | 65% | Foundational Research | Manufacturing &amp; Matter |</w:t>
+      </w:r>
+    </w:p>
+    <w:p>
+      <w:pPr>
+        <w:pStyle w:val="BodyText"/>
+      </w:pPr>
+      <w:r>
+        <w:t xml:space="preserve">Whole Brain Emulation | 59% | N/A | 40% | Foundational Research | Mind, Brain &amp; Human Augmentation |</w:t>
+      </w:r>
+    </w:p>
+    <w:bookmarkEnd w:id="160"/>
+    <w:bookmarkEnd w:id="161"/>
     <w:sectPr>
       <w:footnotePr>
         <w:numRestart w:val="eachSect"/>

</xml_diff>